<commit_message>
feat(report): render and embed all UML, DFD, and architecture diagrams into Word report
</commit_message>
<xml_diff>
--- a/Lab_Inventory_Management_System_Project_Report.docx
+++ b/Lab_Inventory_Management_System_Project_Report.docx
@@ -599,7 +599,7 @@
                 <w:sz w:val="24"/>
                 <w:szCs w:val="24"/>
               </w:rPr>
-              <w:t xml:space="preserve">1</w:t>
+              <w:t xml:space="preserve">2.1</w:t>
             </w:r>
           </w:p>
         </w:tc>
@@ -641,7 +641,7 @@
                 <w:sz w:val="24"/>
                 <w:szCs w:val="24"/>
               </w:rPr>
-              <w:t xml:space="preserve">22</w:t>
+              <w:t xml:space="preserve">18</w:t>
             </w:r>
           </w:p>
         </w:tc>
@@ -664,7 +664,7 @@
                 <w:sz w:val="24"/>
                 <w:szCs w:val="24"/>
               </w:rPr>
-              <w:t xml:space="preserve">2</w:t>
+              <w:t xml:space="preserve">2.2</w:t>
             </w:r>
           </w:p>
         </w:tc>
@@ -706,7 +706,7 @@
                 <w:sz w:val="24"/>
                 <w:szCs w:val="24"/>
               </w:rPr>
-              <w:t xml:space="preserve">23</w:t>
+              <w:t xml:space="preserve">19</w:t>
             </w:r>
           </w:p>
         </w:tc>
@@ -729,49 +729,49 @@
                 <w:sz w:val="24"/>
                 <w:szCs w:val="24"/>
               </w:rPr>
-              <w:t xml:space="preserve">3</w:t>
-            </w:r>
-          </w:p>
-        </w:tc>
-        <w:tc>
-          <w:p>
-            <w:pPr>
-              <w:spacing w:after="140" w:line="320"/>
-              <w:jc w:val="both"/>
-            </w:pPr>
-            <w:r>
-              <w:rPr>
-                <w:rFonts w:ascii="Calibri" w:cs="Calibri" w:eastAsia="Calibri" w:hAnsi="Calibri"/>
-                <w:b w:val="false"/>
-                <w:bCs w:val="false"/>
-                <w:i w:val="false"/>
-                <w:iCs w:val="false"/>
-                <w:color w:val="222222"/>
-                <w:sz w:val="24"/>
-                <w:szCs w:val="24"/>
-              </w:rPr>
-              <w:t xml:space="preserve">Sequence Diagram (Checkout, Approval, Stock Deduction &amp; Handover)</w:t>
-            </w:r>
-          </w:p>
-        </w:tc>
-        <w:tc>
-          <w:p>
-            <w:pPr>
-              <w:spacing w:after="140" w:line="320"/>
-              <w:jc w:val="both"/>
-            </w:pPr>
-            <w:r>
-              <w:rPr>
-                <w:rFonts w:ascii="Calibri" w:cs="Calibri" w:eastAsia="Calibri" w:hAnsi="Calibri"/>
-                <w:b w:val="false"/>
-                <w:bCs w:val="false"/>
-                <w:i w:val="false"/>
-                <w:iCs w:val="false"/>
-                <w:color w:val="222222"/>
-                <w:sz w:val="24"/>
-                <w:szCs w:val="24"/>
-              </w:rPr>
-              <w:t xml:space="preserve">24</w:t>
+              <w:t xml:space="preserve">2.3</w:t>
+            </w:r>
+          </w:p>
+        </w:tc>
+        <w:tc>
+          <w:p>
+            <w:pPr>
+              <w:spacing w:after="140" w:line="320"/>
+              <w:jc w:val="both"/>
+            </w:pPr>
+            <w:r>
+              <w:rPr>
+                <w:rFonts w:ascii="Calibri" w:cs="Calibri" w:eastAsia="Calibri" w:hAnsi="Calibri"/>
+                <w:b w:val="false"/>
+                <w:bCs w:val="false"/>
+                <w:i w:val="false"/>
+                <w:iCs w:val="false"/>
+                <w:color w:val="222222"/>
+                <w:sz w:val="24"/>
+                <w:szCs w:val="24"/>
+              </w:rPr>
+              <w:t xml:space="preserve">Sequence Diagram (Checkout, Approval, Stock Deduction &amp; Reminders)</w:t>
+            </w:r>
+          </w:p>
+        </w:tc>
+        <w:tc>
+          <w:p>
+            <w:pPr>
+              <w:spacing w:after="140" w:line="320"/>
+              <w:jc w:val="both"/>
+            </w:pPr>
+            <w:r>
+              <w:rPr>
+                <w:rFonts w:ascii="Calibri" w:cs="Calibri" w:eastAsia="Calibri" w:hAnsi="Calibri"/>
+                <w:b w:val="false"/>
+                <w:bCs w:val="false"/>
+                <w:i w:val="false"/>
+                <w:iCs w:val="false"/>
+                <w:color w:val="222222"/>
+                <w:sz w:val="24"/>
+                <w:szCs w:val="24"/>
+              </w:rPr>
+              <w:t xml:space="preserve">20</w:t>
             </w:r>
           </w:p>
         </w:tc>
@@ -794,49 +794,49 @@
                 <w:sz w:val="24"/>
                 <w:szCs w:val="24"/>
               </w:rPr>
-              <w:t xml:space="preserve">4</w:t>
-            </w:r>
-          </w:p>
-        </w:tc>
-        <w:tc>
-          <w:p>
-            <w:pPr>
-              <w:spacing w:after="140" w:line="320"/>
-              <w:jc w:val="both"/>
-            </w:pPr>
-            <w:r>
-              <w:rPr>
-                <w:rFonts w:ascii="Calibri" w:cs="Calibri" w:eastAsia="Calibri" w:hAnsi="Calibri"/>
-                <w:b w:val="false"/>
-                <w:bCs w:val="false"/>
-                <w:i w:val="false"/>
-                <w:iCs w:val="false"/>
-                <w:color w:val="222222"/>
-                <w:sz w:val="24"/>
-                <w:szCs w:val="24"/>
-              </w:rPr>
-              <w:t xml:space="preserve">Entity-Relationship (ER) Diagram / MongoDB Document Schema Model)</w:t>
-            </w:r>
-          </w:p>
-        </w:tc>
-        <w:tc>
-          <w:p>
-            <w:pPr>
-              <w:spacing w:after="140" w:line="320"/>
-              <w:jc w:val="both"/>
-            </w:pPr>
-            <w:r>
-              <w:rPr>
-                <w:rFonts w:ascii="Calibri" w:cs="Calibri" w:eastAsia="Calibri" w:hAnsi="Calibri"/>
-                <w:b w:val="false"/>
-                <w:bCs w:val="false"/>
-                <w:i w:val="false"/>
-                <w:iCs w:val="false"/>
-                <w:color w:val="222222"/>
-                <w:sz w:val="24"/>
-                <w:szCs w:val="24"/>
-              </w:rPr>
-              <w:t xml:space="preserve">25</w:t>
+              <w:t xml:space="preserve">2.4</w:t>
+            </w:r>
+          </w:p>
+        </w:tc>
+        <w:tc>
+          <w:p>
+            <w:pPr>
+              <w:spacing w:after="140" w:line="320"/>
+              <w:jc w:val="both"/>
+            </w:pPr>
+            <w:r>
+              <w:rPr>
+                <w:rFonts w:ascii="Calibri" w:cs="Calibri" w:eastAsia="Calibri" w:hAnsi="Calibri"/>
+                <w:b w:val="false"/>
+                <w:bCs w:val="false"/>
+                <w:i w:val="false"/>
+                <w:iCs w:val="false"/>
+                <w:color w:val="222222"/>
+                <w:sz w:val="24"/>
+                <w:szCs w:val="24"/>
+              </w:rPr>
+              <w:t xml:space="preserve">Entity-Relationship (ER) Diagram (MongoDB Collections &amp; Cardinality)</w:t>
+            </w:r>
+          </w:p>
+        </w:tc>
+        <w:tc>
+          <w:p>
+            <w:pPr>
+              <w:spacing w:after="140" w:line="320"/>
+              <w:jc w:val="both"/>
+            </w:pPr>
+            <w:r>
+              <w:rPr>
+                <w:rFonts w:ascii="Calibri" w:cs="Calibri" w:eastAsia="Calibri" w:hAnsi="Calibri"/>
+                <w:b w:val="false"/>
+                <w:bCs w:val="false"/>
+                <w:i w:val="false"/>
+                <w:iCs w:val="false"/>
+                <w:color w:val="222222"/>
+                <w:sz w:val="24"/>
+                <w:szCs w:val="24"/>
+              </w:rPr>
+              <w:t xml:space="preserve">21</w:t>
             </w:r>
           </w:p>
         </w:tc>
@@ -859,49 +859,49 @@
                 <w:sz w:val="24"/>
                 <w:szCs w:val="24"/>
               </w:rPr>
-              <w:t xml:space="preserve">5</w:t>
-            </w:r>
-          </w:p>
-        </w:tc>
-        <w:tc>
-          <w:p>
-            <w:pPr>
-              <w:spacing w:after="140" w:line="320"/>
-              <w:jc w:val="both"/>
-            </w:pPr>
-            <w:r>
-              <w:rPr>
-                <w:rFonts w:ascii="Calibri" w:cs="Calibri" w:eastAsia="Calibri" w:hAnsi="Calibri"/>
-                <w:b w:val="false"/>
-                <w:bCs w:val="false"/>
-                <w:i w:val="false"/>
-                <w:iCs w:val="false"/>
-                <w:color w:val="222222"/>
-                <w:sz w:val="24"/>
-                <w:szCs w:val="24"/>
-              </w:rPr>
-              <w:t xml:space="preserve">Data Flow Diagram (DFD Level 0 Context &amp; Level 1 Decomposition)</w:t>
-            </w:r>
-          </w:p>
-        </w:tc>
-        <w:tc>
-          <w:p>
-            <w:pPr>
-              <w:spacing w:after="140" w:line="320"/>
-              <w:jc w:val="both"/>
-            </w:pPr>
-            <w:r>
-              <w:rPr>
-                <w:rFonts w:ascii="Calibri" w:cs="Calibri" w:eastAsia="Calibri" w:hAnsi="Calibri"/>
-                <w:b w:val="false"/>
-                <w:bCs w:val="false"/>
-                <w:i w:val="false"/>
-                <w:iCs w:val="false"/>
-                <w:color w:val="222222"/>
-                <w:sz w:val="24"/>
-                <w:szCs w:val="24"/>
-              </w:rPr>
-              <w:t xml:space="preserve">26</w:t>
+              <w:t xml:space="preserve">2.5</w:t>
+            </w:r>
+          </w:p>
+        </w:tc>
+        <w:tc>
+          <w:p>
+            <w:pPr>
+              <w:spacing w:after="140" w:line="320"/>
+              <w:jc w:val="both"/>
+            </w:pPr>
+            <w:r>
+              <w:rPr>
+                <w:rFonts w:ascii="Calibri" w:cs="Calibri" w:eastAsia="Calibri" w:hAnsi="Calibri"/>
+                <w:b w:val="false"/>
+                <w:bCs w:val="false"/>
+                <w:i w:val="false"/>
+                <w:iCs w:val="false"/>
+                <w:color w:val="222222"/>
+                <w:sz w:val="24"/>
+                <w:szCs w:val="24"/>
+              </w:rPr>
+              <w:t xml:space="preserve">Data Flow Diagram Level 0 (System Context Diagram)</w:t>
+            </w:r>
+          </w:p>
+        </w:tc>
+        <w:tc>
+          <w:p>
+            <w:pPr>
+              <w:spacing w:after="140" w:line="320"/>
+              <w:jc w:val="both"/>
+            </w:pPr>
+            <w:r>
+              <w:rPr>
+                <w:rFonts w:ascii="Calibri" w:cs="Calibri" w:eastAsia="Calibri" w:hAnsi="Calibri"/>
+                <w:b w:val="false"/>
+                <w:bCs w:val="false"/>
+                <w:i w:val="false"/>
+                <w:iCs w:val="false"/>
+                <w:color w:val="222222"/>
+                <w:sz w:val="24"/>
+                <w:szCs w:val="24"/>
+              </w:rPr>
+              <w:t xml:space="preserve">22</w:t>
             </w:r>
           </w:p>
         </w:tc>
@@ -924,49 +924,49 @@
                 <w:sz w:val="24"/>
                 <w:szCs w:val="24"/>
               </w:rPr>
-              <w:t xml:space="preserve">6</w:t>
-            </w:r>
-          </w:p>
-        </w:tc>
-        <w:tc>
-          <w:p>
-            <w:pPr>
-              <w:spacing w:after="140" w:line="320"/>
-              <w:jc w:val="both"/>
-            </w:pPr>
-            <w:r>
-              <w:rPr>
-                <w:rFonts w:ascii="Calibri" w:cs="Calibri" w:eastAsia="Calibri" w:hAnsi="Calibri"/>
-                <w:b w:val="false"/>
-                <w:bCs w:val="false"/>
-                <w:i w:val="false"/>
-                <w:iCs w:val="false"/>
-                <w:color w:val="222222"/>
-                <w:sz w:val="24"/>
-                <w:szCs w:val="24"/>
-              </w:rPr>
-              <w:t xml:space="preserve">Unified Student &amp; Faculty Login and Student Sign-Up Interface</w:t>
-            </w:r>
-          </w:p>
-        </w:tc>
-        <w:tc>
-          <w:p>
-            <w:pPr>
-              <w:spacing w:after="140" w:line="320"/>
-              <w:jc w:val="both"/>
-            </w:pPr>
-            <w:r>
-              <w:rPr>
-                <w:rFonts w:ascii="Calibri" w:cs="Calibri" w:eastAsia="Calibri" w:hAnsi="Calibri"/>
-                <w:b w:val="false"/>
-                <w:bCs w:val="false"/>
-                <w:i w:val="false"/>
-                <w:iCs w:val="false"/>
-                <w:color w:val="222222"/>
-                <w:sz w:val="24"/>
-                <w:szCs w:val="24"/>
-              </w:rPr>
-              <w:t xml:space="preserve">27</w:t>
+              <w:t xml:space="preserve">2.6</w:t>
+            </w:r>
+          </w:p>
+        </w:tc>
+        <w:tc>
+          <w:p>
+            <w:pPr>
+              <w:spacing w:after="140" w:line="320"/>
+              <w:jc w:val="both"/>
+            </w:pPr>
+            <w:r>
+              <w:rPr>
+                <w:rFonts w:ascii="Calibri" w:cs="Calibri" w:eastAsia="Calibri" w:hAnsi="Calibri"/>
+                <w:b w:val="false"/>
+                <w:bCs w:val="false"/>
+                <w:i w:val="false"/>
+                <w:iCs w:val="false"/>
+                <w:color w:val="222222"/>
+                <w:sz w:val="24"/>
+                <w:szCs w:val="24"/>
+              </w:rPr>
+              <w:t xml:space="preserve">Data Flow Diagram Level 1 (Functional Decomposition &amp; Process Engines)</w:t>
+            </w:r>
+          </w:p>
+        </w:tc>
+        <w:tc>
+          <w:p>
+            <w:pPr>
+              <w:spacing w:after="140" w:line="320"/>
+              <w:jc w:val="both"/>
+            </w:pPr>
+            <w:r>
+              <w:rPr>
+                <w:rFonts w:ascii="Calibri" w:cs="Calibri" w:eastAsia="Calibri" w:hAnsi="Calibri"/>
+                <w:b w:val="false"/>
+                <w:bCs w:val="false"/>
+                <w:i w:val="false"/>
+                <w:iCs w:val="false"/>
+                <w:color w:val="222222"/>
+                <w:sz w:val="24"/>
+                <w:szCs w:val="24"/>
+              </w:rPr>
+              <w:t xml:space="preserve">23</w:t>
             </w:r>
           </w:p>
         </w:tc>
@@ -989,49 +989,49 @@
                 <w:sz w:val="24"/>
                 <w:szCs w:val="24"/>
               </w:rPr>
-              <w:t xml:space="preserve">7</w:t>
-            </w:r>
-          </w:p>
-        </w:tc>
-        <w:tc>
-          <w:p>
-            <w:pPr>
-              <w:spacing w:after="140" w:line="320"/>
-              <w:jc w:val="both"/>
-            </w:pPr>
-            <w:r>
-              <w:rPr>
-                <w:rFonts w:ascii="Calibri" w:cs="Calibri" w:eastAsia="Calibri" w:hAnsi="Calibri"/>
-                <w:b w:val="false"/>
-                <w:bCs w:val="false"/>
-                <w:i w:val="false"/>
-                <w:iCs w:val="false"/>
-                <w:color w:val="222222"/>
-                <w:sz w:val="24"/>
-                <w:szCs w:val="24"/>
-              </w:rPr>
-              <w:t xml:space="preserve">Administrator Authenticator (6-digit TOTP) Login Portal</w:t>
-            </w:r>
-          </w:p>
-        </w:tc>
-        <w:tc>
-          <w:p>
-            <w:pPr>
-              <w:spacing w:after="140" w:line="320"/>
-              <w:jc w:val="both"/>
-            </w:pPr>
-            <w:r>
-              <w:rPr>
-                <w:rFonts w:ascii="Calibri" w:cs="Calibri" w:eastAsia="Calibri" w:hAnsi="Calibri"/>
-                <w:b w:val="false"/>
-                <w:bCs w:val="false"/>
-                <w:i w:val="false"/>
-                <w:iCs w:val="false"/>
-                <w:color w:val="222222"/>
-                <w:sz w:val="24"/>
-                <w:szCs w:val="24"/>
-              </w:rPr>
-              <w:t xml:space="preserve">28</w:t>
+              <w:t xml:space="preserve">2.7</w:t>
+            </w:r>
+          </w:p>
+        </w:tc>
+        <w:tc>
+          <w:p>
+            <w:pPr>
+              <w:spacing w:after="140" w:line="320"/>
+              <w:jc w:val="both"/>
+            </w:pPr>
+            <w:r>
+              <w:rPr>
+                <w:rFonts w:ascii="Calibri" w:cs="Calibri" w:eastAsia="Calibri" w:hAnsi="Calibri"/>
+                <w:b w:val="false"/>
+                <w:bCs w:val="false"/>
+                <w:i w:val="false"/>
+                <w:iCs w:val="false"/>
+                <w:color w:val="222222"/>
+                <w:sz w:val="24"/>
+                <w:szCs w:val="24"/>
+              </w:rPr>
+              <w:t xml:space="preserve">Three-Tier Software Architecture Diagram (Client, Server &amp; Database)</w:t>
+            </w:r>
+          </w:p>
+        </w:tc>
+        <w:tc>
+          <w:p>
+            <w:pPr>
+              <w:spacing w:after="140" w:line="320"/>
+              <w:jc w:val="both"/>
+            </w:pPr>
+            <w:r>
+              <w:rPr>
+                <w:rFonts w:ascii="Calibri" w:cs="Calibri" w:eastAsia="Calibri" w:hAnsi="Calibri"/>
+                <w:b w:val="false"/>
+                <w:bCs w:val="false"/>
+                <w:i w:val="false"/>
+                <w:iCs w:val="false"/>
+                <w:color w:val="222222"/>
+                <w:sz w:val="24"/>
+                <w:szCs w:val="24"/>
+              </w:rPr>
+              <w:t xml:space="preserve">24</w:t>
             </w:r>
           </w:p>
         </w:tc>
@@ -1054,49 +1054,49 @@
                 <w:sz w:val="24"/>
                 <w:szCs w:val="24"/>
               </w:rPr>
-              <w:t xml:space="preserve">8</w:t>
-            </w:r>
-          </w:p>
-        </w:tc>
-        <w:tc>
-          <w:p>
-            <w:pPr>
-              <w:spacing w:after="140" w:line="320"/>
-              <w:jc w:val="both"/>
-            </w:pPr>
-            <w:r>
-              <w:rPr>
-                <w:rFonts w:ascii="Calibri" w:cs="Calibri" w:eastAsia="Calibri" w:hAnsi="Calibri"/>
-                <w:b w:val="false"/>
-                <w:bCs w:val="false"/>
-                <w:i w:val="false"/>
-                <w:iCs w:val="false"/>
-                <w:color w:val="222222"/>
-                <w:sz w:val="24"/>
-                <w:szCs w:val="24"/>
-              </w:rPr>
-              <w:t xml:space="preserve">Student Dashboard with Active Metrics &amp; Borrowing History</w:t>
-            </w:r>
-          </w:p>
-        </w:tc>
-        <w:tc>
-          <w:p>
-            <w:pPr>
-              <w:spacing w:after="140" w:line="320"/>
-              <w:jc w:val="both"/>
-            </w:pPr>
-            <w:r>
-              <w:rPr>
-                <w:rFonts w:ascii="Calibri" w:cs="Calibri" w:eastAsia="Calibri" w:hAnsi="Calibri"/>
-                <w:b w:val="false"/>
-                <w:bCs w:val="false"/>
-                <w:i w:val="false"/>
-                <w:iCs w:val="false"/>
-                <w:color w:val="222222"/>
-                <w:sz w:val="24"/>
-                <w:szCs w:val="24"/>
-              </w:rPr>
-              <w:t xml:space="preserve">29</w:t>
+              <w:t xml:space="preserve">3.1</w:t>
+            </w:r>
+          </w:p>
+        </w:tc>
+        <w:tc>
+          <w:p>
+            <w:pPr>
+              <w:spacing w:after="140" w:line="320"/>
+              <w:jc w:val="both"/>
+            </w:pPr>
+            <w:r>
+              <w:rPr>
+                <w:rFonts w:ascii="Calibri" w:cs="Calibri" w:eastAsia="Calibri" w:hAnsi="Calibri"/>
+                <w:b w:val="false"/>
+                <w:bCs w:val="false"/>
+                <w:i w:val="false"/>
+                <w:iCs w:val="false"/>
+                <w:color w:val="222222"/>
+                <w:sz w:val="24"/>
+                <w:szCs w:val="24"/>
+              </w:rPr>
+              <w:t xml:space="preserve">Unified Student &amp; Faculty Login and Student Sign-Up Interface</w:t>
+            </w:r>
+          </w:p>
+        </w:tc>
+        <w:tc>
+          <w:p>
+            <w:pPr>
+              <w:spacing w:after="140" w:line="320"/>
+              <w:jc w:val="both"/>
+            </w:pPr>
+            <w:r>
+              <w:rPr>
+                <w:rFonts w:ascii="Calibri" w:cs="Calibri" w:eastAsia="Calibri" w:hAnsi="Calibri"/>
+                <w:b w:val="false"/>
+                <w:bCs w:val="false"/>
+                <w:i w:val="false"/>
+                <w:iCs w:val="false"/>
+                <w:color w:val="222222"/>
+                <w:sz w:val="24"/>
+                <w:szCs w:val="24"/>
+              </w:rPr>
+              <w:t xml:space="preserve">25</w:t>
             </w:r>
           </w:p>
         </w:tc>
@@ -1119,49 +1119,49 @@
                 <w:sz w:val="24"/>
                 <w:szCs w:val="24"/>
               </w:rPr>
-              <w:t xml:space="preserve">9</w:t>
-            </w:r>
-          </w:p>
-        </w:tc>
-        <w:tc>
-          <w:p>
-            <w:pPr>
-              <w:spacing w:after="140" w:line="320"/>
-              <w:jc w:val="both"/>
-            </w:pPr>
-            <w:r>
-              <w:rPr>
-                <w:rFonts w:ascii="Calibri" w:cs="Calibri" w:eastAsia="Calibri" w:hAnsi="Calibri"/>
-                <w:b w:val="false"/>
-                <w:bCs w:val="false"/>
-                <w:i w:val="false"/>
-                <w:iCs w:val="false"/>
-                <w:color w:val="222222"/>
-                <w:sz w:val="24"/>
-                <w:szCs w:val="24"/>
-              </w:rPr>
-              <w:t xml:space="preserve">Lab Equipment Inventory Catalog with Availability Progress Meters</w:t>
-            </w:r>
-          </w:p>
-        </w:tc>
-        <w:tc>
-          <w:p>
-            <w:pPr>
-              <w:spacing w:after="140" w:line="320"/>
-              <w:jc w:val="both"/>
-            </w:pPr>
-            <w:r>
-              <w:rPr>
-                <w:rFonts w:ascii="Calibri" w:cs="Calibri" w:eastAsia="Calibri" w:hAnsi="Calibri"/>
-                <w:b w:val="false"/>
-                <w:bCs w:val="false"/>
-                <w:i w:val="false"/>
-                <w:iCs w:val="false"/>
-                <w:color w:val="222222"/>
-                <w:sz w:val="24"/>
-                <w:szCs w:val="24"/>
-              </w:rPr>
-              <w:t xml:space="preserve">30</w:t>
+              <w:t xml:space="preserve">3.2</w:t>
+            </w:r>
+          </w:p>
+        </w:tc>
+        <w:tc>
+          <w:p>
+            <w:pPr>
+              <w:spacing w:after="140" w:line="320"/>
+              <w:jc w:val="both"/>
+            </w:pPr>
+            <w:r>
+              <w:rPr>
+                <w:rFonts w:ascii="Calibri" w:cs="Calibri" w:eastAsia="Calibri" w:hAnsi="Calibri"/>
+                <w:b w:val="false"/>
+                <w:bCs w:val="false"/>
+                <w:i w:val="false"/>
+                <w:iCs w:val="false"/>
+                <w:color w:val="222222"/>
+                <w:sz w:val="24"/>
+                <w:szCs w:val="24"/>
+              </w:rPr>
+              <w:t xml:space="preserve">Administrator Authenticator (6-digit TOTP) Login Portal</w:t>
+            </w:r>
+          </w:p>
+        </w:tc>
+        <w:tc>
+          <w:p>
+            <w:pPr>
+              <w:spacing w:after="140" w:line="320"/>
+              <w:jc w:val="both"/>
+            </w:pPr>
+            <w:r>
+              <w:rPr>
+                <w:rFonts w:ascii="Calibri" w:cs="Calibri" w:eastAsia="Calibri" w:hAnsi="Calibri"/>
+                <w:b w:val="false"/>
+                <w:bCs w:val="false"/>
+                <w:i w:val="false"/>
+                <w:iCs w:val="false"/>
+                <w:color w:val="222222"/>
+                <w:sz w:val="24"/>
+                <w:szCs w:val="24"/>
+              </w:rPr>
+              <w:t xml:space="preserve">26</w:t>
             </w:r>
           </w:p>
         </w:tc>
@@ -1184,49 +1184,49 @@
                 <w:sz w:val="24"/>
                 <w:szCs w:val="24"/>
               </w:rPr>
-              <w:t xml:space="preserve">10</w:t>
-            </w:r>
-          </w:p>
-        </w:tc>
-        <w:tc>
-          <w:p>
-            <w:pPr>
-              <w:spacing w:after="140" w:line="320"/>
-              <w:jc w:val="both"/>
-            </w:pPr>
-            <w:r>
-              <w:rPr>
-                <w:rFonts w:ascii="Calibri" w:cs="Calibri" w:eastAsia="Calibri" w:hAnsi="Calibri"/>
-                <w:b w:val="false"/>
-                <w:bCs w:val="false"/>
-                <w:i w:val="false"/>
-                <w:iCs w:val="false"/>
-                <w:color w:val="222222"/>
-                <w:sz w:val="24"/>
-                <w:szCs w:val="24"/>
-              </w:rPr>
-              <w:t xml:space="preserve">Requisition &amp; Document Upload Checkout Modal</w:t>
-            </w:r>
-          </w:p>
-        </w:tc>
-        <w:tc>
-          <w:p>
-            <w:pPr>
-              <w:spacing w:after="140" w:line="320"/>
-              <w:jc w:val="both"/>
-            </w:pPr>
-            <w:r>
-              <w:rPr>
-                <w:rFonts w:ascii="Calibri" w:cs="Calibri" w:eastAsia="Calibri" w:hAnsi="Calibri"/>
-                <w:b w:val="false"/>
-                <w:bCs w:val="false"/>
-                <w:i w:val="false"/>
-                <w:iCs w:val="false"/>
-                <w:color w:val="222222"/>
-                <w:sz w:val="24"/>
-                <w:szCs w:val="24"/>
-              </w:rPr>
-              <w:t xml:space="preserve">31</w:t>
+              <w:t xml:space="preserve">3.3</w:t>
+            </w:r>
+          </w:p>
+        </w:tc>
+        <w:tc>
+          <w:p>
+            <w:pPr>
+              <w:spacing w:after="140" w:line="320"/>
+              <w:jc w:val="both"/>
+            </w:pPr>
+            <w:r>
+              <w:rPr>
+                <w:rFonts w:ascii="Calibri" w:cs="Calibri" w:eastAsia="Calibri" w:hAnsi="Calibri"/>
+                <w:b w:val="false"/>
+                <w:bCs w:val="false"/>
+                <w:i w:val="false"/>
+                <w:iCs w:val="false"/>
+                <w:color w:val="222222"/>
+                <w:sz w:val="24"/>
+                <w:szCs w:val="24"/>
+              </w:rPr>
+              <w:t xml:space="preserve">Student Dashboard with Active Metrics &amp; Borrowing History</w:t>
+            </w:r>
+          </w:p>
+        </w:tc>
+        <w:tc>
+          <w:p>
+            <w:pPr>
+              <w:spacing w:after="140" w:line="320"/>
+              <w:jc w:val="both"/>
+            </w:pPr>
+            <w:r>
+              <w:rPr>
+                <w:rFonts w:ascii="Calibri" w:cs="Calibri" w:eastAsia="Calibri" w:hAnsi="Calibri"/>
+                <w:b w:val="false"/>
+                <w:bCs w:val="false"/>
+                <w:i w:val="false"/>
+                <w:iCs w:val="false"/>
+                <w:color w:val="222222"/>
+                <w:sz w:val="24"/>
+                <w:szCs w:val="24"/>
+              </w:rPr>
+              <w:t xml:space="preserve">27</w:t>
             </w:r>
           </w:p>
         </w:tc>
@@ -1249,49 +1249,49 @@
                 <w:sz w:val="24"/>
                 <w:szCs w:val="24"/>
               </w:rPr>
-              <w:t xml:space="preserve">11</w:t>
-            </w:r>
-          </w:p>
-        </w:tc>
-        <w:tc>
-          <w:p>
-            <w:pPr>
-              <w:spacing w:after="140" w:line="320"/>
-              <w:jc w:val="both"/>
-            </w:pPr>
-            <w:r>
-              <w:rPr>
-                <w:rFonts w:ascii="Calibri" w:cs="Calibri" w:eastAsia="Calibri" w:hAnsi="Calibri"/>
-                <w:b w:val="false"/>
-                <w:bCs w:val="false"/>
-                <w:i w:val="false"/>
-                <w:iCs w:val="false"/>
-                <w:color w:val="222222"/>
-                <w:sz w:val="24"/>
-                <w:szCs w:val="24"/>
-              </w:rPr>
-              <w:t xml:space="preserve">Faculty Approval Dashboard, Handover &amp; Return Verification</w:t>
-            </w:r>
-          </w:p>
-        </w:tc>
-        <w:tc>
-          <w:p>
-            <w:pPr>
-              <w:spacing w:after="140" w:line="320"/>
-              <w:jc w:val="both"/>
-            </w:pPr>
-            <w:r>
-              <w:rPr>
-                <w:rFonts w:ascii="Calibri" w:cs="Calibri" w:eastAsia="Calibri" w:hAnsi="Calibri"/>
-                <w:b w:val="false"/>
-                <w:bCs w:val="false"/>
-                <w:i w:val="false"/>
-                <w:iCs w:val="false"/>
-                <w:color w:val="222222"/>
-                <w:sz w:val="24"/>
-                <w:szCs w:val="24"/>
-              </w:rPr>
-              <w:t xml:space="preserve">32</w:t>
+              <w:t xml:space="preserve">3.4</w:t>
+            </w:r>
+          </w:p>
+        </w:tc>
+        <w:tc>
+          <w:p>
+            <w:pPr>
+              <w:spacing w:after="140" w:line="320"/>
+              <w:jc w:val="both"/>
+            </w:pPr>
+            <w:r>
+              <w:rPr>
+                <w:rFonts w:ascii="Calibri" w:cs="Calibri" w:eastAsia="Calibri" w:hAnsi="Calibri"/>
+                <w:b w:val="false"/>
+                <w:bCs w:val="false"/>
+                <w:i w:val="false"/>
+                <w:iCs w:val="false"/>
+                <w:color w:val="222222"/>
+                <w:sz w:val="24"/>
+                <w:szCs w:val="24"/>
+              </w:rPr>
+              <w:t xml:space="preserve">Lab Equipment Inventory Catalog with Availability Progress Meters</w:t>
+            </w:r>
+          </w:p>
+        </w:tc>
+        <w:tc>
+          <w:p>
+            <w:pPr>
+              <w:spacing w:after="140" w:line="320"/>
+              <w:jc w:val="both"/>
+            </w:pPr>
+            <w:r>
+              <w:rPr>
+                <w:rFonts w:ascii="Calibri" w:cs="Calibri" w:eastAsia="Calibri" w:hAnsi="Calibri"/>
+                <w:b w:val="false"/>
+                <w:bCs w:val="false"/>
+                <w:i w:val="false"/>
+                <w:iCs w:val="false"/>
+                <w:color w:val="222222"/>
+                <w:sz w:val="24"/>
+                <w:szCs w:val="24"/>
+              </w:rPr>
+              <w:t xml:space="preserve">28</w:t>
             </w:r>
           </w:p>
         </w:tc>
@@ -1314,49 +1314,49 @@
                 <w:sz w:val="24"/>
                 <w:szCs w:val="24"/>
               </w:rPr>
-              <w:t xml:space="preserve">12</w:t>
-            </w:r>
-          </w:p>
-        </w:tc>
-        <w:tc>
-          <w:p>
-            <w:pPr>
-              <w:spacing w:after="140" w:line="320"/>
-              <w:jc w:val="both"/>
-            </w:pPr>
-            <w:r>
-              <w:rPr>
-                <w:rFonts w:ascii="Calibri" w:cs="Calibri" w:eastAsia="Calibri" w:hAnsi="Calibri"/>
-                <w:b w:val="false"/>
-                <w:bCs w:val="false"/>
-                <w:i w:val="false"/>
-                <w:iCs w:val="false"/>
-                <w:color w:val="222222"/>
-                <w:sz w:val="24"/>
-                <w:szCs w:val="24"/>
-              </w:rPr>
-              <w:t xml:space="preserve">Administrator Decision Override Panel &amp; Audit Trail Log</w:t>
-            </w:r>
-          </w:p>
-        </w:tc>
-        <w:tc>
-          <w:p>
-            <w:pPr>
-              <w:spacing w:after="140" w:line="320"/>
-              <w:jc w:val="both"/>
-            </w:pPr>
-            <w:r>
-              <w:rPr>
-                <w:rFonts w:ascii="Calibri" w:cs="Calibri" w:eastAsia="Calibri" w:hAnsi="Calibri"/>
-                <w:b w:val="false"/>
-                <w:bCs w:val="false"/>
-                <w:i w:val="false"/>
-                <w:iCs w:val="false"/>
-                <w:color w:val="222222"/>
-                <w:sz w:val="24"/>
-                <w:szCs w:val="24"/>
-              </w:rPr>
-              <w:t xml:space="preserve">33</w:t>
+              <w:t xml:space="preserve">3.5</w:t>
+            </w:r>
+          </w:p>
+        </w:tc>
+        <w:tc>
+          <w:p>
+            <w:pPr>
+              <w:spacing w:after="140" w:line="320"/>
+              <w:jc w:val="both"/>
+            </w:pPr>
+            <w:r>
+              <w:rPr>
+                <w:rFonts w:ascii="Calibri" w:cs="Calibri" w:eastAsia="Calibri" w:hAnsi="Calibri"/>
+                <w:b w:val="false"/>
+                <w:bCs w:val="false"/>
+                <w:i w:val="false"/>
+                <w:iCs w:val="false"/>
+                <w:color w:val="222222"/>
+                <w:sz w:val="24"/>
+                <w:szCs w:val="24"/>
+              </w:rPr>
+              <w:t xml:space="preserve">Requisition &amp; Document Upload Checkout Modal</w:t>
+            </w:r>
+          </w:p>
+        </w:tc>
+        <w:tc>
+          <w:p>
+            <w:pPr>
+              <w:spacing w:after="140" w:line="320"/>
+              <w:jc w:val="both"/>
+            </w:pPr>
+            <w:r>
+              <w:rPr>
+                <w:rFonts w:ascii="Calibri" w:cs="Calibri" w:eastAsia="Calibri" w:hAnsi="Calibri"/>
+                <w:b w:val="false"/>
+                <w:bCs w:val="false"/>
+                <w:i w:val="false"/>
+                <w:iCs w:val="false"/>
+                <w:color w:val="222222"/>
+                <w:sz w:val="24"/>
+                <w:szCs w:val="24"/>
+              </w:rPr>
+              <w:t xml:space="preserve">29</w:t>
             </w:r>
           </w:p>
         </w:tc>
@@ -1379,7 +1379,137 @@
                 <w:sz w:val="24"/>
                 <w:szCs w:val="24"/>
               </w:rPr>
-              <w:t xml:space="preserve">13</w:t>
+              <w:t xml:space="preserve">3.6</w:t>
+            </w:r>
+          </w:p>
+        </w:tc>
+        <w:tc>
+          <w:p>
+            <w:pPr>
+              <w:spacing w:after="140" w:line="320"/>
+              <w:jc w:val="both"/>
+            </w:pPr>
+            <w:r>
+              <w:rPr>
+                <w:rFonts w:ascii="Calibri" w:cs="Calibri" w:eastAsia="Calibri" w:hAnsi="Calibri"/>
+                <w:b w:val="false"/>
+                <w:bCs w:val="false"/>
+                <w:i w:val="false"/>
+                <w:iCs w:val="false"/>
+                <w:color w:val="222222"/>
+                <w:sz w:val="24"/>
+                <w:szCs w:val="24"/>
+              </w:rPr>
+              <w:t xml:space="preserve">Faculty Approval Dashboard, Handover &amp; Return Verification</w:t>
+            </w:r>
+          </w:p>
+        </w:tc>
+        <w:tc>
+          <w:p>
+            <w:pPr>
+              <w:spacing w:after="140" w:line="320"/>
+              <w:jc w:val="both"/>
+            </w:pPr>
+            <w:r>
+              <w:rPr>
+                <w:rFonts w:ascii="Calibri" w:cs="Calibri" w:eastAsia="Calibri" w:hAnsi="Calibri"/>
+                <w:b w:val="false"/>
+                <w:bCs w:val="false"/>
+                <w:i w:val="false"/>
+                <w:iCs w:val="false"/>
+                <w:color w:val="222222"/>
+                <w:sz w:val="24"/>
+                <w:szCs w:val="24"/>
+              </w:rPr>
+              <w:t xml:space="preserve">30</w:t>
+            </w:r>
+          </w:p>
+        </w:tc>
+      </w:tr>
+      <w:tr>
+        <w:tc>
+          <w:p>
+            <w:pPr>
+              <w:spacing w:after="140" w:line="320"/>
+              <w:jc w:val="both"/>
+            </w:pPr>
+            <w:r>
+              <w:rPr>
+                <w:rFonts w:ascii="Calibri" w:cs="Calibri" w:eastAsia="Calibri" w:hAnsi="Calibri"/>
+                <w:b w:val="false"/>
+                <w:bCs w:val="false"/>
+                <w:i w:val="false"/>
+                <w:iCs w:val="false"/>
+                <w:color w:val="222222"/>
+                <w:sz w:val="24"/>
+                <w:szCs w:val="24"/>
+              </w:rPr>
+              <w:t xml:space="preserve">3.7</w:t>
+            </w:r>
+          </w:p>
+        </w:tc>
+        <w:tc>
+          <w:p>
+            <w:pPr>
+              <w:spacing w:after="140" w:line="320"/>
+              <w:jc w:val="both"/>
+            </w:pPr>
+            <w:r>
+              <w:rPr>
+                <w:rFonts w:ascii="Calibri" w:cs="Calibri" w:eastAsia="Calibri" w:hAnsi="Calibri"/>
+                <w:b w:val="false"/>
+                <w:bCs w:val="false"/>
+                <w:i w:val="false"/>
+                <w:iCs w:val="false"/>
+                <w:color w:val="222222"/>
+                <w:sz w:val="24"/>
+                <w:szCs w:val="24"/>
+              </w:rPr>
+              <w:t xml:space="preserve">Administrator Decision Override Panel &amp; Audit Trail Log</w:t>
+            </w:r>
+          </w:p>
+        </w:tc>
+        <w:tc>
+          <w:p>
+            <w:pPr>
+              <w:spacing w:after="140" w:line="320"/>
+              <w:jc w:val="both"/>
+            </w:pPr>
+            <w:r>
+              <w:rPr>
+                <w:rFonts w:ascii="Calibri" w:cs="Calibri" w:eastAsia="Calibri" w:hAnsi="Calibri"/>
+                <w:b w:val="false"/>
+                <w:bCs w:val="false"/>
+                <w:i w:val="false"/>
+                <w:iCs w:val="false"/>
+                <w:color w:val="222222"/>
+                <w:sz w:val="24"/>
+                <w:szCs w:val="24"/>
+              </w:rPr>
+              <w:t xml:space="preserve">31</w:t>
+            </w:r>
+          </w:p>
+        </w:tc>
+      </w:tr>
+      <w:tr>
+        <w:tc>
+          <w:p>
+            <w:pPr>
+              <w:spacing w:after="140" w:line="320"/>
+              <w:jc w:val="both"/>
+            </w:pPr>
+            <w:r>
+              <w:rPr>
+                <w:rFonts w:ascii="Calibri" w:cs="Calibri" w:eastAsia="Calibri" w:hAnsi="Calibri"/>
+                <w:b w:val="false"/>
+                <w:bCs w:val="false"/>
+                <w:i w:val="false"/>
+                <w:iCs w:val="false"/>
+                <w:color w:val="222222"/>
+                <w:sz w:val="24"/>
+                <w:szCs w:val="24"/>
+              </w:rPr>
+              <w:t xml:space="preserve">3.8</w:t>
             </w:r>
           </w:p>
         </w:tc>
@@ -1421,7 +1551,7 @@
                 <w:sz w:val="24"/>
                 <w:szCs w:val="24"/>
               </w:rPr>
-              <w:t xml:space="preserve">34</w:t>
+              <w:t xml:space="preserve">32</w:t>
             </w:r>
           </w:p>
         </w:tc>
@@ -3753,7 +3883,7 @@
           <w:sz w:val="24"/>
           <w:szCs w:val="24"/>
         </w:rPr>
-        <w:t xml:space="preserve">To formally represent the architecture, behavior, and data flow of the system, five standard UML modeling diagrams were constructed:</w:t>
+        <w:t xml:space="preserve">To formally represent the architecture, behavior, and data flow of the system, comprehensive UML modeling diagrams and architectural blueprints were constructed:</w:t>
       </w:r>
     </w:p>
     <w:p>
@@ -3794,31 +3924,67 @@
     </w:p>
     <w:p>
       <w:pPr>
-        <w:spacing w:after="200" w:before="200"/>
+        <w:spacing w:after="100" w:before="180"/>
         <w:jc w:val="center"/>
       </w:pPr>
       <w:r>
-        <w:rPr>
-          <w:rFonts w:ascii="Calibri" w:cs="Calibri" w:eastAsia="Calibri" w:hAnsi="Calibri"/>
-          <w:b/>
-          <w:bCs/>
-          <w:color w:val="8D2F1E"/>
-          <w:sz w:val="24"/>
-          <w:szCs w:val="24"/>
-        </w:rPr>
-        <w:t xml:space="preserve">[INSERT IMAGE: Figure 1: Use Case Diagram]</w:t>
-      </w:r>
-      <w:r>
-        <w:rPr>
-          <w:rFonts w:ascii="Calibri" w:cs="Calibri" w:eastAsia="Calibri" w:hAnsi="Calibri"/>
+        <w:drawing>
+          <wp:inline distT="0" distB="0" distL="0" distR="0">
+            <wp:extent cx="3810000" cy="5048250"/>
+            <wp:effectExtent t="0" r="0" b="0" l="0"/>
+            <wp:docPr id="1" name=""/>
+            <wp:cNvGraphicFramePr>
+              <a:graphicFrameLocks xmlns:a="http://schemas.openxmlformats.org/drawingml/2006/main" noChangeAspect="1"/>
+            </wp:cNvGraphicFramePr>
+            <a:graphic xmlns:a="http://schemas.openxmlformats.org/drawingml/2006/main">
+              <a:graphicData uri="http://schemas.openxmlformats.org/drawingml/2006/picture">
+                <pic:pic xmlns:pic="http://schemas.openxmlformats.org/drawingml/2006/picture">
+                  <pic:nvPicPr>
+                    <pic:cNvPr id="0" name="" descr=""/>
+                    <pic:cNvPicPr>
+                      <a:picLocks noChangeAspect="1" noChangeArrowheads="1"/>
+                    </pic:cNvPicPr>
+                  </pic:nvPicPr>
+                  <pic:blipFill>
+                    <a:blip r:embed="rId7" cstate="none"/>
+                    <a:srcRect/>
+                    <a:stretch>
+                      <a:fillRect/>
+                    </a:stretch>
+                  </pic:blipFill>
+                  <pic:spPr bwMode="auto">
+                    <a:xfrm>
+                      <a:off x="0" y="0"/>
+                      <a:ext cx="3810000" cy="5048250"/>
+                    </a:xfrm>
+                    <a:prstGeom prst="rect">
+                      <a:avLst/>
+                    </a:prstGeom>
+                  </pic:spPr>
+                </pic:pic>
+              </a:graphicData>
+            </a:graphic>
+          </wp:inline>
+        </w:drawing>
+      </w:r>
+    </w:p>
+    <w:p>
+      <w:pPr>
+        <w:spacing w:after="220"/>
+        <w:jc w:val="center"/>
+      </w:pPr>
+      <w:r>
+        <w:rPr>
+          <w:rFonts w:ascii="Calibri" w:cs="Calibri" w:eastAsia="Calibri" w:hAnsi="Calibri"/>
+          <w:b/>
+          <w:bCs/>
           <w:i/>
           <w:iCs/>
-          <w:color w:val="666666"/>
+          <w:color w:val="5C381E"/>
           <w:sz w:val="20"/>
           <w:szCs w:val="20"/>
         </w:rPr>
-        <w:t xml:space="preserve">
-(Insert exported Use Case diagram image here)</w:t>
+        <w:t xml:space="preserve">Figure 2.1: Use Case Diagram (Actor-System Functional Interactions)</w:t>
       </w:r>
     </w:p>
     <w:p>
@@ -3859,31 +4025,67 @@
     </w:p>
     <w:p>
       <w:pPr>
-        <w:spacing w:after="200" w:before="200"/>
+        <w:spacing w:after="100" w:before="180"/>
         <w:jc w:val="center"/>
       </w:pPr>
       <w:r>
-        <w:rPr>
-          <w:rFonts w:ascii="Calibri" w:cs="Calibri" w:eastAsia="Calibri" w:hAnsi="Calibri"/>
-          <w:b/>
-          <w:bCs/>
-          <w:color w:val="8D2F1E"/>
-          <w:sz w:val="24"/>
-          <w:szCs w:val="24"/>
-        </w:rPr>
-        <w:t xml:space="preserve">[INSERT IMAGE: Figure 2: Activity Diagram]</w:t>
-      </w:r>
-      <w:r>
-        <w:rPr>
-          <w:rFonts w:ascii="Calibri" w:cs="Calibri" w:eastAsia="Calibri" w:hAnsi="Calibri"/>
+        <w:drawing>
+          <wp:inline distT="0" distB="0" distL="0" distR="0">
+            <wp:extent cx="2476500" cy="6286500"/>
+            <wp:effectExtent t="0" r="0" b="0" l="0"/>
+            <wp:docPr id="2" name=""/>
+            <wp:cNvGraphicFramePr>
+              <a:graphicFrameLocks xmlns:a="http://schemas.openxmlformats.org/drawingml/2006/main" noChangeAspect="1"/>
+            </wp:cNvGraphicFramePr>
+            <a:graphic xmlns:a="http://schemas.openxmlformats.org/drawingml/2006/main">
+              <a:graphicData uri="http://schemas.openxmlformats.org/drawingml/2006/picture">
+                <pic:pic xmlns:pic="http://schemas.openxmlformats.org/drawingml/2006/picture">
+                  <pic:nvPicPr>
+                    <pic:cNvPr id="0" name="" descr=""/>
+                    <pic:cNvPicPr>
+                      <a:picLocks noChangeAspect="1" noChangeArrowheads="1"/>
+                    </pic:cNvPicPr>
+                  </pic:nvPicPr>
+                  <pic:blipFill>
+                    <a:blip r:embed="rId8" cstate="none"/>
+                    <a:srcRect/>
+                    <a:stretch>
+                      <a:fillRect/>
+                    </a:stretch>
+                  </pic:blipFill>
+                  <pic:spPr bwMode="auto">
+                    <a:xfrm>
+                      <a:off x="0" y="0"/>
+                      <a:ext cx="2476500" cy="6286500"/>
+                    </a:xfrm>
+                    <a:prstGeom prst="rect">
+                      <a:avLst/>
+                    </a:prstGeom>
+                  </pic:spPr>
+                </pic:pic>
+              </a:graphicData>
+            </a:graphic>
+          </wp:inline>
+        </w:drawing>
+      </w:r>
+    </w:p>
+    <w:p>
+      <w:pPr>
+        <w:spacing w:after="220"/>
+        <w:jc w:val="center"/>
+      </w:pPr>
+      <w:r>
+        <w:rPr>
+          <w:rFonts w:ascii="Calibri" w:cs="Calibri" w:eastAsia="Calibri" w:hAnsi="Calibri"/>
+          <w:b/>
+          <w:bCs/>
           <w:i/>
           <w:iCs/>
-          <w:color w:val="666666"/>
+          <w:color w:val="5C381E"/>
           <w:sz w:val="20"/>
           <w:szCs w:val="20"/>
         </w:rPr>
-        <w:t xml:space="preserve">
-(Insert exported Activity Diagram image here)</w:t>
+        <w:t xml:space="preserve">Figure 2.2: Activity Diagram (Equipment Requisition, Approval, Issuance &amp; Return Lifecycle)</w:t>
       </w:r>
     </w:p>
     <w:p>
@@ -3924,31 +4126,67 @@
     </w:p>
     <w:p>
       <w:pPr>
-        <w:spacing w:after="200" w:before="200"/>
+        <w:spacing w:after="100" w:before="180"/>
         <w:jc w:val="center"/>
       </w:pPr>
       <w:r>
-        <w:rPr>
-          <w:rFonts w:ascii="Calibri" w:cs="Calibri" w:eastAsia="Calibri" w:hAnsi="Calibri"/>
-          <w:b/>
-          <w:bCs/>
-          <w:color w:val="8D2F1E"/>
-          <w:sz w:val="24"/>
-          <w:szCs w:val="24"/>
-        </w:rPr>
-        <w:t xml:space="preserve">[INSERT IMAGE: Figure 3: Sequence Diagram]</w:t>
-      </w:r>
-      <w:r>
-        <w:rPr>
-          <w:rFonts w:ascii="Calibri" w:cs="Calibri" w:eastAsia="Calibri" w:hAnsi="Calibri"/>
+        <w:drawing>
+          <wp:inline distT="0" distB="0" distL="0" distR="0">
+            <wp:extent cx="4762500" cy="3810000"/>
+            <wp:effectExtent t="0" r="0" b="0" l="0"/>
+            <wp:docPr id="3" name=""/>
+            <wp:cNvGraphicFramePr>
+              <a:graphicFrameLocks xmlns:a="http://schemas.openxmlformats.org/drawingml/2006/main" noChangeAspect="1"/>
+            </wp:cNvGraphicFramePr>
+            <a:graphic xmlns:a="http://schemas.openxmlformats.org/drawingml/2006/main">
+              <a:graphicData uri="http://schemas.openxmlformats.org/drawingml/2006/picture">
+                <pic:pic xmlns:pic="http://schemas.openxmlformats.org/drawingml/2006/picture">
+                  <pic:nvPicPr>
+                    <pic:cNvPr id="0" name="" descr=""/>
+                    <pic:cNvPicPr>
+                      <a:picLocks noChangeAspect="1" noChangeArrowheads="1"/>
+                    </pic:cNvPicPr>
+                  </pic:nvPicPr>
+                  <pic:blipFill>
+                    <a:blip r:embed="rId9" cstate="none"/>
+                    <a:srcRect/>
+                    <a:stretch>
+                      <a:fillRect/>
+                    </a:stretch>
+                  </pic:blipFill>
+                  <pic:spPr bwMode="auto">
+                    <a:xfrm>
+                      <a:off x="0" y="0"/>
+                      <a:ext cx="4762500" cy="3810000"/>
+                    </a:xfrm>
+                    <a:prstGeom prst="rect">
+                      <a:avLst/>
+                    </a:prstGeom>
+                  </pic:spPr>
+                </pic:pic>
+              </a:graphicData>
+            </a:graphic>
+          </wp:inline>
+        </w:drawing>
+      </w:r>
+    </w:p>
+    <w:p>
+      <w:pPr>
+        <w:spacing w:after="220"/>
+        <w:jc w:val="center"/>
+      </w:pPr>
+      <w:r>
+        <w:rPr>
+          <w:rFonts w:ascii="Calibri" w:cs="Calibri" w:eastAsia="Calibri" w:hAnsi="Calibri"/>
+          <w:b/>
+          <w:bCs/>
           <w:i/>
           <w:iCs/>
-          <w:color w:val="666666"/>
+          <w:color w:val="5C381E"/>
           <w:sz w:val="20"/>
           <w:szCs w:val="20"/>
         </w:rPr>
-        <w:t xml:space="preserve">
-(Insert exported Sequence Diagram image here)</w:t>
+        <w:t xml:space="preserve">Figure 2.3: Sequence Diagram (Requisition, Approval, Stock Deduction &amp; Scheduled Reminders)</w:t>
       </w:r>
     </w:p>
     <w:p>
@@ -3989,31 +4227,67 @@
     </w:p>
     <w:p>
       <w:pPr>
-        <w:spacing w:after="200" w:before="200"/>
+        <w:spacing w:after="100" w:before="180"/>
         <w:jc w:val="center"/>
       </w:pPr>
       <w:r>
-        <w:rPr>
-          <w:rFonts w:ascii="Calibri" w:cs="Calibri" w:eastAsia="Calibri" w:hAnsi="Calibri"/>
-          <w:b/>
-          <w:bCs/>
-          <w:color w:val="8D2F1E"/>
-          <w:sz w:val="24"/>
-          <w:szCs w:val="24"/>
-        </w:rPr>
-        <w:t xml:space="preserve">[INSERT IMAGE: Figure 4: ER Diagram]</w:t>
-      </w:r>
-      <w:r>
-        <w:rPr>
-          <w:rFonts w:ascii="Calibri" w:cs="Calibri" w:eastAsia="Calibri" w:hAnsi="Calibri"/>
+        <w:drawing>
+          <wp:inline distT="0" distB="0" distL="0" distR="0">
+            <wp:extent cx="4762500" cy="4476750"/>
+            <wp:effectExtent t="0" r="0" b="0" l="0"/>
+            <wp:docPr id="4" name=""/>
+            <wp:cNvGraphicFramePr>
+              <a:graphicFrameLocks xmlns:a="http://schemas.openxmlformats.org/drawingml/2006/main" noChangeAspect="1"/>
+            </wp:cNvGraphicFramePr>
+            <a:graphic xmlns:a="http://schemas.openxmlformats.org/drawingml/2006/main">
+              <a:graphicData uri="http://schemas.openxmlformats.org/drawingml/2006/picture">
+                <pic:pic xmlns:pic="http://schemas.openxmlformats.org/drawingml/2006/picture">
+                  <pic:nvPicPr>
+                    <pic:cNvPr id="0" name="" descr=""/>
+                    <pic:cNvPicPr>
+                      <a:picLocks noChangeAspect="1" noChangeArrowheads="1"/>
+                    </pic:cNvPicPr>
+                  </pic:nvPicPr>
+                  <pic:blipFill>
+                    <a:blip r:embed="rId10" cstate="none"/>
+                    <a:srcRect/>
+                    <a:stretch>
+                      <a:fillRect/>
+                    </a:stretch>
+                  </pic:blipFill>
+                  <pic:spPr bwMode="auto">
+                    <a:xfrm>
+                      <a:off x="0" y="0"/>
+                      <a:ext cx="4762500" cy="4476750"/>
+                    </a:xfrm>
+                    <a:prstGeom prst="rect">
+                      <a:avLst/>
+                    </a:prstGeom>
+                  </pic:spPr>
+                </pic:pic>
+              </a:graphicData>
+            </a:graphic>
+          </wp:inline>
+        </w:drawing>
+      </w:r>
+    </w:p>
+    <w:p>
+      <w:pPr>
+        <w:spacing w:after="220"/>
+        <w:jc w:val="center"/>
+      </w:pPr>
+      <w:r>
+        <w:rPr>
+          <w:rFonts w:ascii="Calibri" w:cs="Calibri" w:eastAsia="Calibri" w:hAnsi="Calibri"/>
+          <w:b/>
+          <w:bCs/>
           <w:i/>
           <w:iCs/>
-          <w:color w:val="666666"/>
+          <w:color w:val="5C381E"/>
           <w:sz w:val="20"/>
           <w:szCs w:val="20"/>
         </w:rPr>
-        <w:t xml:space="preserve">
-(Insert exported ER Diagram image here)</w:t>
+        <w:t xml:space="preserve">Figure 2.4: Entity-Relationship (ER) Diagram (MongoDB Collections, Schemas &amp; Cardinality)</w:t>
       </w:r>
     </w:p>
     <w:p>
@@ -4030,7 +4304,7 @@
           <w:sz w:val="22"/>
           <w:szCs w:val="22"/>
         </w:rPr>
-        <w:t xml:space="preserve">2.6.5 Data Flow Diagram (DFD Level 0 &amp; Level 1)</w:t>
+        <w:t xml:space="preserve">2.6.5 Data Flow Diagram Level 0 (Context Diagram)</w:t>
       </w:r>
     </w:p>
     <w:p>
@@ -4049,62 +4323,89 @@
           <w:sz w:val="24"/>
           <w:szCs w:val="24"/>
         </w:rPr>
-        <w:t xml:space="preserve">Depicts the flow of data across system boundaries, transformations through functional controllers, and persistence into MongoDB storage collections.</w:t>
-      </w:r>
-    </w:p>
-    <w:p>
-      <w:pPr>
-        <w:spacing w:after="200" w:before="200"/>
+        <w:t xml:space="preserve">Depicts the flow of information across external human entities, internal processing pipelines, the cloud persistence layer, and the background notification service.</w:t>
+      </w:r>
+    </w:p>
+    <w:p>
+      <w:pPr>
+        <w:spacing w:after="100" w:before="180"/>
         <w:jc w:val="center"/>
       </w:pPr>
       <w:r>
-        <w:rPr>
-          <w:rFonts w:ascii="Calibri" w:cs="Calibri" w:eastAsia="Calibri" w:hAnsi="Calibri"/>
-          <w:b/>
-          <w:bCs/>
-          <w:color w:val="8D2F1E"/>
-          <w:sz w:val="24"/>
-          <w:szCs w:val="24"/>
-        </w:rPr>
-        <w:t xml:space="preserve">[INSERT IMAGE: Figure 5: Data Flow Diagram]</w:t>
-      </w:r>
-      <w:r>
-        <w:rPr>
-          <w:rFonts w:ascii="Calibri" w:cs="Calibri" w:eastAsia="Calibri" w:hAnsi="Calibri"/>
+        <w:drawing>
+          <wp:inline distT="0" distB="0" distL="0" distR="0">
+            <wp:extent cx="4762500" cy="2743200"/>
+            <wp:effectExtent t="0" r="0" b="0" l="0"/>
+            <wp:docPr id="5" name=""/>
+            <wp:cNvGraphicFramePr>
+              <a:graphicFrameLocks xmlns:a="http://schemas.openxmlformats.org/drawingml/2006/main" noChangeAspect="1"/>
+            </wp:cNvGraphicFramePr>
+            <a:graphic xmlns:a="http://schemas.openxmlformats.org/drawingml/2006/main">
+              <a:graphicData uri="http://schemas.openxmlformats.org/drawingml/2006/picture">
+                <pic:pic xmlns:pic="http://schemas.openxmlformats.org/drawingml/2006/picture">
+                  <pic:nvPicPr>
+                    <pic:cNvPr id="0" name="" descr=""/>
+                    <pic:cNvPicPr>
+                      <a:picLocks noChangeAspect="1" noChangeArrowheads="1"/>
+                    </pic:cNvPicPr>
+                  </pic:nvPicPr>
+                  <pic:blipFill>
+                    <a:blip r:embed="rId11" cstate="none"/>
+                    <a:srcRect/>
+                    <a:stretch>
+                      <a:fillRect/>
+                    </a:stretch>
+                  </pic:blipFill>
+                  <pic:spPr bwMode="auto">
+                    <a:xfrm>
+                      <a:off x="0" y="0"/>
+                      <a:ext cx="4762500" cy="2743200"/>
+                    </a:xfrm>
+                    <a:prstGeom prst="rect">
+                      <a:avLst/>
+                    </a:prstGeom>
+                  </pic:spPr>
+                </pic:pic>
+              </a:graphicData>
+            </a:graphic>
+          </wp:inline>
+        </w:drawing>
+      </w:r>
+    </w:p>
+    <w:p>
+      <w:pPr>
+        <w:spacing w:after="220"/>
+        <w:jc w:val="center"/>
+      </w:pPr>
+      <w:r>
+        <w:rPr>
+          <w:rFonts w:ascii="Calibri" w:cs="Calibri" w:eastAsia="Calibri" w:hAnsi="Calibri"/>
+          <w:b/>
+          <w:bCs/>
           <w:i/>
           <w:iCs/>
-          <w:color w:val="666666"/>
+          <w:color w:val="5C381E"/>
           <w:sz w:val="20"/>
           <w:szCs w:val="20"/>
         </w:rPr>
-        <w:t xml:space="preserve">
-(Insert exported DFD diagram image here)</w:t>
-      </w:r>
-    </w:p>
-    <w:p>
-      <w:pPr>
-        <w:pageBreakBefore/>
-      </w:pPr>
-      <w:r>
-        <w:br/>
-      </w:r>
-    </w:p>
-    <w:p>
-      <w:pPr>
-        <w:pStyle w:val="Heading1"/>
-        <w:spacing w:after="200" w:before="240"/>
-        <w:jc w:val="center"/>
-      </w:pPr>
-      <w:r>
-        <w:rPr>
-          <w:rFonts w:ascii="Calibri" w:cs="Calibri" w:eastAsia="Calibri" w:hAnsi="Calibri"/>
-          <w:b/>
-          <w:bCs/>
-          <w:color w:val="2C1D11"/>
-          <w:sz w:val="32"/>
-          <w:szCs w:val="32"/>
-        </w:rPr>
-        <w:t xml:space="preserve">Chapter: 3 Implementation of Project</w:t>
+        <w:t xml:space="preserve">Figure 2.5: Data Flow Diagram Level 0 (System Context Diagram)</w:t>
+      </w:r>
+    </w:p>
+    <w:p>
+      <w:pPr>
+        <w:pStyle w:val="Heading3"/>
+        <w:spacing w:after="80" w:before="160"/>
+      </w:pPr>
+      <w:r>
+        <w:rPr>
+          <w:rFonts w:ascii="Calibri" w:cs="Calibri" w:eastAsia="Calibri" w:hAnsi="Calibri"/>
+          <w:b/>
+          <w:bCs/>
+          <w:color w:val="333333"/>
+          <w:sz w:val="22"/>
+          <w:szCs w:val="22"/>
+        </w:rPr>
+        <w:t xml:space="preserve">2.6.6 Data Flow Diagram Level 1 (Functional Decomposition)</w:t>
       </w:r>
     </w:p>
     <w:p>
@@ -4123,24 +4424,89 @@
           <w:sz w:val="24"/>
           <w:szCs w:val="24"/>
         </w:rPr>
-        <w:t xml:space="preserve">This chapter presents the user interfaces, page workflows, and operational capabilities implemented across the front-end and back-end stacks.</w:t>
-      </w:r>
-    </w:p>
-    <w:p>
-      <w:pPr>
-        <w:pStyle w:val="Heading2"/>
-        <w:spacing w:after="120" w:before="200"/>
-      </w:pPr>
-      <w:r>
-        <w:rPr>
-          <w:rFonts w:ascii="Calibri" w:cs="Calibri" w:eastAsia="Calibri" w:hAnsi="Calibri"/>
-          <w:b/>
-          <w:bCs/>
-          <w:color w:val="5C381E"/>
-          <w:sz w:val="26"/>
-          <w:szCs w:val="26"/>
-        </w:rPr>
-        <w:t xml:space="preserve">3.1 Unified Login &amp; Student Registration Interface</w:t>
+        <w:t xml:space="preserve">Decomposes the core system into discrete operational sub-engines (Authentication, Inventory Catalog, Requisition Processing, Approval &amp; Handover, Governance Override, and Deadline Assessment).</w:t>
+      </w:r>
+    </w:p>
+    <w:p>
+      <w:pPr>
+        <w:spacing w:after="100" w:before="180"/>
+        <w:jc w:val="center"/>
+      </w:pPr>
+      <w:r>
+        <w:drawing>
+          <wp:inline distT="0" distB="0" distL="0" distR="0">
+            <wp:extent cx="4953000" cy="1524000"/>
+            <wp:effectExtent t="0" r="0" b="0" l="0"/>
+            <wp:docPr id="6" name=""/>
+            <wp:cNvGraphicFramePr>
+              <a:graphicFrameLocks xmlns:a="http://schemas.openxmlformats.org/drawingml/2006/main" noChangeAspect="1"/>
+            </wp:cNvGraphicFramePr>
+            <a:graphic xmlns:a="http://schemas.openxmlformats.org/drawingml/2006/main">
+              <a:graphicData uri="http://schemas.openxmlformats.org/drawingml/2006/picture">
+                <pic:pic xmlns:pic="http://schemas.openxmlformats.org/drawingml/2006/picture">
+                  <pic:nvPicPr>
+                    <pic:cNvPr id="0" name="" descr=""/>
+                    <pic:cNvPicPr>
+                      <a:picLocks noChangeAspect="1" noChangeArrowheads="1"/>
+                    </pic:cNvPicPr>
+                  </pic:nvPicPr>
+                  <pic:blipFill>
+                    <a:blip r:embed="rId12" cstate="none"/>
+                    <a:srcRect/>
+                    <a:stretch>
+                      <a:fillRect/>
+                    </a:stretch>
+                  </pic:blipFill>
+                  <pic:spPr bwMode="auto">
+                    <a:xfrm>
+                      <a:off x="0" y="0"/>
+                      <a:ext cx="4953000" cy="1524000"/>
+                    </a:xfrm>
+                    <a:prstGeom prst="rect">
+                      <a:avLst/>
+                    </a:prstGeom>
+                  </pic:spPr>
+                </pic:pic>
+              </a:graphicData>
+            </a:graphic>
+          </wp:inline>
+        </w:drawing>
+      </w:r>
+    </w:p>
+    <w:p>
+      <w:pPr>
+        <w:spacing w:after="220"/>
+        <w:jc w:val="center"/>
+      </w:pPr>
+      <w:r>
+        <w:rPr>
+          <w:rFonts w:ascii="Calibri" w:cs="Calibri" w:eastAsia="Calibri" w:hAnsi="Calibri"/>
+          <w:b/>
+          <w:bCs/>
+          <w:i/>
+          <w:iCs/>
+          <w:color w:val="5C381E"/>
+          <w:sz w:val="20"/>
+          <w:szCs w:val="20"/>
+        </w:rPr>
+        <w:t xml:space="preserve">Figure 2.6: Data Flow Diagram Level 1 (Functional Decomposition &amp; Process Engines)</w:t>
+      </w:r>
+    </w:p>
+    <w:p>
+      <w:pPr>
+        <w:pStyle w:val="Heading3"/>
+        <w:spacing w:after="80" w:before="160"/>
+      </w:pPr>
+      <w:r>
+        <w:rPr>
+          <w:rFonts w:ascii="Calibri" w:cs="Calibri" w:eastAsia="Calibri" w:hAnsi="Calibri"/>
+          <w:b/>
+          <w:bCs/>
+          <w:color w:val="333333"/>
+          <w:sz w:val="22"/>
+          <w:szCs w:val="22"/>
+        </w:rPr>
+        <w:t xml:space="preserve">2.6.7 Three-Tier Software Architecture Diagram</w:t>
       </w:r>
     </w:p>
     <w:p>
@@ -4159,53 +4525,98 @@
           <w:sz w:val="24"/>
           <w:szCs w:val="24"/>
         </w:rPr>
-        <w:t xml:space="preserve">Provides a unified sign-in portal for Students and Faculty, along with a full Student Registration tab collecting student name, university email, phone number, program, semester, division, stay type, and encrypted password.</w:t>
-      </w:r>
-    </w:p>
-    <w:p>
-      <w:pPr>
-        <w:spacing w:after="200" w:before="200"/>
+        <w:t xml:space="preserve">Illustrates the multi-tiered architecture of the system, comprising the React/Vite Presentation Tier, the Node.js/Express Business Logic &amp; API Tier with middleware and background schedulers, and the MongoDB Atlas Cloud Persistence Tier.</w:t>
+      </w:r>
+    </w:p>
+    <w:p>
+      <w:pPr>
+        <w:spacing w:after="100" w:before="180"/>
         <w:jc w:val="center"/>
       </w:pPr>
       <w:r>
-        <w:rPr>
-          <w:rFonts w:ascii="Calibri" w:cs="Calibri" w:eastAsia="Calibri" w:hAnsi="Calibri"/>
-          <w:b/>
-          <w:bCs/>
-          <w:color w:val="8D2F1E"/>
-          <w:sz w:val="24"/>
-          <w:szCs w:val="24"/>
-        </w:rPr>
-        <w:t xml:space="preserve">[INSERT IMAGE: Figure 6: Login &amp; Student Registration Page]</w:t>
-      </w:r>
-      <w:r>
-        <w:rPr>
-          <w:rFonts w:ascii="Calibri" w:cs="Calibri" w:eastAsia="Calibri" w:hAnsi="Calibri"/>
+        <w:drawing>
+          <wp:inline distT="0" distB="0" distL="0" distR="0">
+            <wp:extent cx="3810000" cy="5143500"/>
+            <wp:effectExtent t="0" r="0" b="0" l="0"/>
+            <wp:docPr id="7" name=""/>
+            <wp:cNvGraphicFramePr>
+              <a:graphicFrameLocks xmlns:a="http://schemas.openxmlformats.org/drawingml/2006/main" noChangeAspect="1"/>
+            </wp:cNvGraphicFramePr>
+            <a:graphic xmlns:a="http://schemas.openxmlformats.org/drawingml/2006/main">
+              <a:graphicData uri="http://schemas.openxmlformats.org/drawingml/2006/picture">
+                <pic:pic xmlns:pic="http://schemas.openxmlformats.org/drawingml/2006/picture">
+                  <pic:nvPicPr>
+                    <pic:cNvPr id="0" name="" descr=""/>
+                    <pic:cNvPicPr>
+                      <a:picLocks noChangeAspect="1" noChangeArrowheads="1"/>
+                    </pic:cNvPicPr>
+                  </pic:nvPicPr>
+                  <pic:blipFill>
+                    <a:blip r:embed="rId13" cstate="none"/>
+                    <a:srcRect/>
+                    <a:stretch>
+                      <a:fillRect/>
+                    </a:stretch>
+                  </pic:blipFill>
+                  <pic:spPr bwMode="auto">
+                    <a:xfrm>
+                      <a:off x="0" y="0"/>
+                      <a:ext cx="3810000" cy="5143500"/>
+                    </a:xfrm>
+                    <a:prstGeom prst="rect">
+                      <a:avLst/>
+                    </a:prstGeom>
+                  </pic:spPr>
+                </pic:pic>
+              </a:graphicData>
+            </a:graphic>
+          </wp:inline>
+        </w:drawing>
+      </w:r>
+    </w:p>
+    <w:p>
+      <w:pPr>
+        <w:spacing w:after="220"/>
+        <w:jc w:val="center"/>
+      </w:pPr>
+      <w:r>
+        <w:rPr>
+          <w:rFonts w:ascii="Calibri" w:cs="Calibri" w:eastAsia="Calibri" w:hAnsi="Calibri"/>
+          <w:b/>
+          <w:bCs/>
           <w:i/>
           <w:iCs/>
-          <w:color w:val="666666"/>
+          <w:color w:val="5C381E"/>
           <w:sz w:val="20"/>
           <w:szCs w:val="20"/>
         </w:rPr>
-        <w:t xml:space="preserve">
-(Insert screenshot of /login page)</w:t>
-      </w:r>
-    </w:p>
-    <w:p>
-      <w:pPr>
-        <w:pStyle w:val="Heading2"/>
-        <w:spacing w:after="120" w:before="200"/>
-      </w:pPr>
-      <w:r>
-        <w:rPr>
-          <w:rFonts w:ascii="Calibri" w:cs="Calibri" w:eastAsia="Calibri" w:hAnsi="Calibri"/>
-          <w:b/>
-          <w:bCs/>
-          <w:color w:val="5C381E"/>
-          <w:sz w:val="26"/>
-          <w:szCs w:val="26"/>
-        </w:rPr>
-        <w:t xml:space="preserve">3.2 Administrator Authenticator (TOTP) Portal</w:t>
+        <w:t xml:space="preserve">Figure 2.7: Three-Tier Software Architecture Diagram (Presentation, Logic &amp; Database Layers)</w:t>
+      </w:r>
+    </w:p>
+    <w:p>
+      <w:pPr>
+        <w:pageBreakBefore/>
+      </w:pPr>
+      <w:r>
+        <w:br/>
+      </w:r>
+    </w:p>
+    <w:p>
+      <w:pPr>
+        <w:pStyle w:val="Heading1"/>
+        <w:spacing w:after="200" w:before="240"/>
+        <w:jc w:val="center"/>
+      </w:pPr>
+      <w:r>
+        <w:rPr>
+          <w:rFonts w:ascii="Calibri" w:cs="Calibri" w:eastAsia="Calibri" w:hAnsi="Calibri"/>
+          <w:b/>
+          <w:bCs/>
+          <w:color w:val="2C1D11"/>
+          <w:sz w:val="32"/>
+          <w:szCs w:val="32"/>
+        </w:rPr>
+        <w:t xml:space="preserve">Chapter: 3 Implementation of Project</w:t>
       </w:r>
     </w:p>
     <w:p>
@@ -4224,36 +4635,7 @@
           <w:sz w:val="24"/>
           <w:szCs w:val="24"/>
         </w:rPr>
-        <w:t xml:space="preserve">Implements a secure administrative gateway requiring university admin credentials and a live 6-digit Time-Based One-Time Password generated from an authenticator app (Google Authenticator / Microsoft Authenticator).</w:t>
-      </w:r>
-    </w:p>
-    <w:p>
-      <w:pPr>
-        <w:spacing w:after="200" w:before="200"/>
-        <w:jc w:val="center"/>
-      </w:pPr>
-      <w:r>
-        <w:rPr>
-          <w:rFonts w:ascii="Calibri" w:cs="Calibri" w:eastAsia="Calibri" w:hAnsi="Calibri"/>
-          <w:b/>
-          <w:bCs/>
-          <w:color w:val="8D2F1E"/>
-          <w:sz w:val="24"/>
-          <w:szCs w:val="24"/>
-        </w:rPr>
-        <w:t xml:space="preserve">[INSERT IMAGE: Figure 7: Administrator TOTP Login Page]</w:t>
-      </w:r>
-      <w:r>
-        <w:rPr>
-          <w:rFonts w:ascii="Calibri" w:cs="Calibri" w:eastAsia="Calibri" w:hAnsi="Calibri"/>
-          <w:i/>
-          <w:iCs/>
-          <w:color w:val="666666"/>
-          <w:sz w:val="20"/>
-          <w:szCs w:val="20"/>
-        </w:rPr>
-        <w:t xml:space="preserve">
-(Insert screenshot of /admin-login page)</w:t>
+        <w:t xml:space="preserve">This chapter presents the actual user interfaces, operational modules, and verified workflows developed across the presentation, logic, and database tiers.</w:t>
       </w:r>
     </w:p>
     <w:p>
@@ -4270,7 +4652,7 @@
           <w:sz w:val="26"/>
           <w:szCs w:val="26"/>
         </w:rPr>
-        <w:t xml:space="preserve">3.3 Student Dashboard &amp; Borrowing History</w:t>
+        <w:t xml:space="preserve">3.1 Unified Login &amp; Student Registration Interface</w:t>
       </w:r>
     </w:p>
     <w:p>
@@ -4289,36 +4671,72 @@
           <w:sz w:val="24"/>
           <w:szCs w:val="24"/>
         </w:rPr>
-        <w:t xml:space="preserve">Displays real-time student metrics (Active Requests, Approved Items, Due Soon, Penalties Due) aggregated directly from MongoDB, alongside complete borrowing records and a 'Get Again' quick re-order action.</w:t>
-      </w:r>
-    </w:p>
-    <w:p>
-      <w:pPr>
-        <w:spacing w:after="200" w:before="200"/>
+        <w:t xml:space="preserve">Provides a unified sign-in portal for Students and Faculty, along with an interactive Student Registration tab collecting student name, university email, phone number, program, semester, division, stay type, and encrypted password.</w:t>
+      </w:r>
+    </w:p>
+    <w:p>
+      <w:pPr>
+        <w:spacing w:after="100" w:before="180"/>
         <w:jc w:val="center"/>
       </w:pPr>
       <w:r>
-        <w:rPr>
-          <w:rFonts w:ascii="Calibri" w:cs="Calibri" w:eastAsia="Calibri" w:hAnsi="Calibri"/>
-          <w:b/>
-          <w:bCs/>
-          <w:color w:val="8D2F1E"/>
-          <w:sz w:val="24"/>
-          <w:szCs w:val="24"/>
-        </w:rPr>
-        <w:t xml:space="preserve">[INSERT IMAGE: Figure 8: Student Dashboard]</w:t>
-      </w:r>
-      <w:r>
-        <w:rPr>
-          <w:rFonts w:ascii="Calibri" w:cs="Calibri" w:eastAsia="Calibri" w:hAnsi="Calibri"/>
+        <w:drawing>
+          <wp:inline distT="0" distB="0" distL="0" distR="0">
+            <wp:extent cx="5143500" cy="3143250"/>
+            <wp:effectExtent t="0" r="0" b="0" l="0"/>
+            <wp:docPr id="8" name=""/>
+            <wp:cNvGraphicFramePr>
+              <a:graphicFrameLocks xmlns:a="http://schemas.openxmlformats.org/drawingml/2006/main" noChangeAspect="1"/>
+            </wp:cNvGraphicFramePr>
+            <a:graphic xmlns:a="http://schemas.openxmlformats.org/drawingml/2006/main">
+              <a:graphicData uri="http://schemas.openxmlformats.org/drawingml/2006/picture">
+                <pic:pic xmlns:pic="http://schemas.openxmlformats.org/drawingml/2006/picture">
+                  <pic:nvPicPr>
+                    <pic:cNvPr id="0" name="" descr=""/>
+                    <pic:cNvPicPr>
+                      <a:picLocks noChangeAspect="1" noChangeArrowheads="1"/>
+                    </pic:cNvPicPr>
+                  </pic:nvPicPr>
+                  <pic:blipFill>
+                    <a:blip r:embed="rId14" cstate="none"/>
+                    <a:srcRect/>
+                    <a:stretch>
+                      <a:fillRect/>
+                    </a:stretch>
+                  </pic:blipFill>
+                  <pic:spPr bwMode="auto">
+                    <a:xfrm>
+                      <a:off x="0" y="0"/>
+                      <a:ext cx="5143500" cy="3143250"/>
+                    </a:xfrm>
+                    <a:prstGeom prst="rect">
+                      <a:avLst/>
+                    </a:prstGeom>
+                  </pic:spPr>
+                </pic:pic>
+              </a:graphicData>
+            </a:graphic>
+          </wp:inline>
+        </w:drawing>
+      </w:r>
+    </w:p>
+    <w:p>
+      <w:pPr>
+        <w:spacing w:after="220"/>
+        <w:jc w:val="center"/>
+      </w:pPr>
+      <w:r>
+        <w:rPr>
+          <w:rFonts w:ascii="Calibri" w:cs="Calibri" w:eastAsia="Calibri" w:hAnsi="Calibri"/>
+          <w:b/>
+          <w:bCs/>
           <w:i/>
           <w:iCs/>
-          <w:color w:val="666666"/>
+          <w:color w:val="5C381E"/>
           <w:sz w:val="20"/>
           <w:szCs w:val="20"/>
         </w:rPr>
-        <w:t xml:space="preserve">
-(Insert screenshot of /student page)</w:t>
+        <w:t xml:space="preserve">Figure 3.1: Unified Student &amp; Faculty Sign In and Student Registration Page</w:t>
       </w:r>
     </w:p>
     <w:p>
@@ -4335,7 +4753,7 @@
           <w:sz w:val="26"/>
           <w:szCs w:val="26"/>
         </w:rPr>
-        <w:t xml:space="preserve">3.4 Lab Equipment Inventory Catalog</w:t>
+        <w:t xml:space="preserve">3.2 Administrator Authenticator (TOTP) Portal</w:t>
       </w:r>
     </w:p>
     <w:p>
@@ -4354,36 +4772,72 @@
           <w:sz w:val="24"/>
           <w:szCs w:val="24"/>
         </w:rPr>
-        <w:t xml:space="preserve">Showcases lab equipment divided by Makers Lab 2 and Design IoT Lab. Each equipment card features category tags, condition ratings, max allowed borrow duration, faculty in-charge email, and an active availability progress meter.</w:t>
-      </w:r>
-    </w:p>
-    <w:p>
-      <w:pPr>
-        <w:spacing w:after="200" w:before="200"/>
+        <w:t xml:space="preserve">Implements a secure administrative gateway requiring university admin credentials and a live 6-digit Time-Based One-Time Password generated from an authenticator app (Google Authenticator / Microsoft Authenticator).</w:t>
+      </w:r>
+    </w:p>
+    <w:p>
+      <w:pPr>
+        <w:spacing w:after="100" w:before="180"/>
         <w:jc w:val="center"/>
       </w:pPr>
       <w:r>
-        <w:rPr>
-          <w:rFonts w:ascii="Calibri" w:cs="Calibri" w:eastAsia="Calibri" w:hAnsi="Calibri"/>
-          <w:b/>
-          <w:bCs/>
-          <w:color w:val="8D2F1E"/>
-          <w:sz w:val="24"/>
-          <w:szCs w:val="24"/>
-        </w:rPr>
-        <w:t xml:space="preserve">[INSERT IMAGE: Figure 9: Inventory Browsing Page]</w:t>
-      </w:r>
-      <w:r>
-        <w:rPr>
-          <w:rFonts w:ascii="Calibri" w:cs="Calibri" w:eastAsia="Calibri" w:hAnsi="Calibri"/>
+        <w:drawing>
+          <wp:inline distT="0" distB="0" distL="0" distR="0">
+            <wp:extent cx="5143500" cy="3143250"/>
+            <wp:effectExtent t="0" r="0" b="0" l="0"/>
+            <wp:docPr id="9" name=""/>
+            <wp:cNvGraphicFramePr>
+              <a:graphicFrameLocks xmlns:a="http://schemas.openxmlformats.org/drawingml/2006/main" noChangeAspect="1"/>
+            </wp:cNvGraphicFramePr>
+            <a:graphic xmlns:a="http://schemas.openxmlformats.org/drawingml/2006/main">
+              <a:graphicData uri="http://schemas.openxmlformats.org/drawingml/2006/picture">
+                <pic:pic xmlns:pic="http://schemas.openxmlformats.org/drawingml/2006/picture">
+                  <pic:nvPicPr>
+                    <pic:cNvPr id="0" name="" descr=""/>
+                    <pic:cNvPicPr>
+                      <a:picLocks noChangeAspect="1" noChangeArrowheads="1"/>
+                    </pic:cNvPicPr>
+                  </pic:nvPicPr>
+                  <pic:blipFill>
+                    <a:blip r:embed="rId15" cstate="none"/>
+                    <a:srcRect/>
+                    <a:stretch>
+                      <a:fillRect/>
+                    </a:stretch>
+                  </pic:blipFill>
+                  <pic:spPr bwMode="auto">
+                    <a:xfrm>
+                      <a:off x="0" y="0"/>
+                      <a:ext cx="5143500" cy="3143250"/>
+                    </a:xfrm>
+                    <a:prstGeom prst="rect">
+                      <a:avLst/>
+                    </a:prstGeom>
+                  </pic:spPr>
+                </pic:pic>
+              </a:graphicData>
+            </a:graphic>
+          </wp:inline>
+        </w:drawing>
+      </w:r>
+    </w:p>
+    <w:p>
+      <w:pPr>
+        <w:spacing w:after="220"/>
+        <w:jc w:val="center"/>
+      </w:pPr>
+      <w:r>
+        <w:rPr>
+          <w:rFonts w:ascii="Calibri" w:cs="Calibri" w:eastAsia="Calibri" w:hAnsi="Calibri"/>
+          <w:b/>
+          <w:bCs/>
           <w:i/>
           <w:iCs/>
-          <w:color w:val="666666"/>
+          <w:color w:val="5C381E"/>
           <w:sz w:val="20"/>
           <w:szCs w:val="20"/>
         </w:rPr>
-        <w:t xml:space="preserve">
-(Insert screenshot of /inventory page)</w:t>
+        <w:t xml:space="preserve">Figure 3.2: Administrator Authenticator (6-digit TOTP) Login Portal</w:t>
       </w:r>
     </w:p>
     <w:p>
@@ -4400,7 +4854,7 @@
           <w:sz w:val="26"/>
           <w:szCs w:val="26"/>
         </w:rPr>
-        <w:t xml:space="preserve">3.5 Requisition Checkout &amp; Document Upload Modal</w:t>
+        <w:t xml:space="preserve">3.3 Student Dashboard &amp; Borrowing History</w:t>
       </w:r>
     </w:p>
     <w:p>
@@ -4419,36 +4873,72 @@
           <w:sz w:val="24"/>
           <w:szCs w:val="24"/>
         </w:rPr>
-        <w:t xml:space="preserve">Enables students to specify required item quantities, define expected return dates, state project purpose, and upload supporting letters (PDF/PNG up to 5MB) via multipart form upload.</w:t>
-      </w:r>
-    </w:p>
-    <w:p>
-      <w:pPr>
-        <w:spacing w:after="200" w:before="200"/>
+        <w:t xml:space="preserve">Displays real-time student metrics (Active Requests, Approved Items, Due Soon, Penalties Due) aggregated directly from MongoDB, alongside complete borrowing records and a 'Get Again' quick re-order action.</w:t>
+      </w:r>
+    </w:p>
+    <w:p>
+      <w:pPr>
+        <w:spacing w:after="100" w:before="180"/>
         <w:jc w:val="center"/>
       </w:pPr>
       <w:r>
-        <w:rPr>
-          <w:rFonts w:ascii="Calibri" w:cs="Calibri" w:eastAsia="Calibri" w:hAnsi="Calibri"/>
-          <w:b/>
-          <w:bCs/>
-          <w:color w:val="8D2F1E"/>
-          <w:sz w:val="24"/>
-          <w:szCs w:val="24"/>
-        </w:rPr>
-        <w:t xml:space="preserve">[INSERT IMAGE: Figure 10: Requisition Modal with Document Upload]</w:t>
-      </w:r>
-      <w:r>
-        <w:rPr>
-          <w:rFonts w:ascii="Calibri" w:cs="Calibri" w:eastAsia="Calibri" w:hAnsi="Calibri"/>
+        <w:drawing>
+          <wp:inline distT="0" distB="0" distL="0" distR="0">
+            <wp:extent cx="5143500" cy="3143250"/>
+            <wp:effectExtent t="0" r="0" b="0" l="0"/>
+            <wp:docPr id="10" name=""/>
+            <wp:cNvGraphicFramePr>
+              <a:graphicFrameLocks xmlns:a="http://schemas.openxmlformats.org/drawingml/2006/main" noChangeAspect="1"/>
+            </wp:cNvGraphicFramePr>
+            <a:graphic xmlns:a="http://schemas.openxmlformats.org/drawingml/2006/main">
+              <a:graphicData uri="http://schemas.openxmlformats.org/drawingml/2006/picture">
+                <pic:pic xmlns:pic="http://schemas.openxmlformats.org/drawingml/2006/picture">
+                  <pic:nvPicPr>
+                    <pic:cNvPr id="0" name="" descr=""/>
+                    <pic:cNvPicPr>
+                      <a:picLocks noChangeAspect="1" noChangeArrowheads="1"/>
+                    </pic:cNvPicPr>
+                  </pic:nvPicPr>
+                  <pic:blipFill>
+                    <a:blip r:embed="rId16" cstate="none"/>
+                    <a:srcRect/>
+                    <a:stretch>
+                      <a:fillRect/>
+                    </a:stretch>
+                  </pic:blipFill>
+                  <pic:spPr bwMode="auto">
+                    <a:xfrm>
+                      <a:off x="0" y="0"/>
+                      <a:ext cx="5143500" cy="3143250"/>
+                    </a:xfrm>
+                    <a:prstGeom prst="rect">
+                      <a:avLst/>
+                    </a:prstGeom>
+                  </pic:spPr>
+                </pic:pic>
+              </a:graphicData>
+            </a:graphic>
+          </wp:inline>
+        </w:drawing>
+      </w:r>
+    </w:p>
+    <w:p>
+      <w:pPr>
+        <w:spacing w:after="220"/>
+        <w:jc w:val="center"/>
+      </w:pPr>
+      <w:r>
+        <w:rPr>
+          <w:rFonts w:ascii="Calibri" w:cs="Calibri" w:eastAsia="Calibri" w:hAnsi="Calibri"/>
+          <w:b/>
+          <w:bCs/>
           <w:i/>
           <w:iCs/>
-          <w:color w:val="666666"/>
+          <w:color w:val="5C381E"/>
           <w:sz w:val="20"/>
           <w:szCs w:val="20"/>
         </w:rPr>
-        <w:t xml:space="preserve">
-(Insert screenshot of Borrow Request modal)</w:t>
+        <w:t xml:space="preserve">Figure 3.3: Student Dashboard with Live Metrics &amp; Borrowing History</w:t>
       </w:r>
     </w:p>
     <w:p>
@@ -4465,7 +4955,7 @@
           <w:sz w:val="26"/>
           <w:szCs w:val="26"/>
         </w:rPr>
-        <w:t xml:space="preserve">3.6 Faculty Approval &amp; Handover Panel</w:t>
+        <w:t xml:space="preserve">3.4 Lab Equipment Inventory Catalog</w:t>
       </w:r>
     </w:p>
     <w:p>
@@ -4484,36 +4974,72 @@
           <w:sz w:val="24"/>
           <w:szCs w:val="24"/>
         </w:rPr>
-        <w:t xml:space="preserve">Provides laboratory faculty with a live queue of pending requests, applicant roll numbers, purpose descriptions, and attached documents. Faculty can approve or reject with remarks, confirm physical handover (decrementing inventory), and verify returns.</w:t>
-      </w:r>
-    </w:p>
-    <w:p>
-      <w:pPr>
-        <w:spacing w:after="200" w:before="200"/>
+        <w:t xml:space="preserve">Showcases lab equipment divided by Makers Lab 2 and Design IoT Lab. Each equipment card features category tags, condition ratings, max allowed borrow duration, faculty in-charge email, and an active availability progress meter.</w:t>
+      </w:r>
+    </w:p>
+    <w:p>
+      <w:pPr>
+        <w:spacing w:after="100" w:before="180"/>
         <w:jc w:val="center"/>
       </w:pPr>
       <w:r>
-        <w:rPr>
-          <w:rFonts w:ascii="Calibri" w:cs="Calibri" w:eastAsia="Calibri" w:hAnsi="Calibri"/>
-          <w:b/>
-          <w:bCs/>
-          <w:color w:val="8D2F1E"/>
-          <w:sz w:val="24"/>
-          <w:szCs w:val="24"/>
-        </w:rPr>
-        <w:t xml:space="preserve">[INSERT IMAGE: Figure 11: Faculty Approval Dashboard]</w:t>
-      </w:r>
-      <w:r>
-        <w:rPr>
-          <w:rFonts w:ascii="Calibri" w:cs="Calibri" w:eastAsia="Calibri" w:hAnsi="Calibri"/>
+        <w:drawing>
+          <wp:inline distT="0" distB="0" distL="0" distR="0">
+            <wp:extent cx="5143500" cy="3143250"/>
+            <wp:effectExtent t="0" r="0" b="0" l="0"/>
+            <wp:docPr id="11" name=""/>
+            <wp:cNvGraphicFramePr>
+              <a:graphicFrameLocks xmlns:a="http://schemas.openxmlformats.org/drawingml/2006/main" noChangeAspect="1"/>
+            </wp:cNvGraphicFramePr>
+            <a:graphic xmlns:a="http://schemas.openxmlformats.org/drawingml/2006/main">
+              <a:graphicData uri="http://schemas.openxmlformats.org/drawingml/2006/picture">
+                <pic:pic xmlns:pic="http://schemas.openxmlformats.org/drawingml/2006/picture">
+                  <pic:nvPicPr>
+                    <pic:cNvPr id="0" name="" descr=""/>
+                    <pic:cNvPicPr>
+                      <a:picLocks noChangeAspect="1" noChangeArrowheads="1"/>
+                    </pic:cNvPicPr>
+                  </pic:nvPicPr>
+                  <pic:blipFill>
+                    <a:blip r:embed="rId17" cstate="none"/>
+                    <a:srcRect/>
+                    <a:stretch>
+                      <a:fillRect/>
+                    </a:stretch>
+                  </pic:blipFill>
+                  <pic:spPr bwMode="auto">
+                    <a:xfrm>
+                      <a:off x="0" y="0"/>
+                      <a:ext cx="5143500" cy="3143250"/>
+                    </a:xfrm>
+                    <a:prstGeom prst="rect">
+                      <a:avLst/>
+                    </a:prstGeom>
+                  </pic:spPr>
+                </pic:pic>
+              </a:graphicData>
+            </a:graphic>
+          </wp:inline>
+        </w:drawing>
+      </w:r>
+    </w:p>
+    <w:p>
+      <w:pPr>
+        <w:spacing w:after="220"/>
+        <w:jc w:val="center"/>
+      </w:pPr>
+      <w:r>
+        <w:rPr>
+          <w:rFonts w:ascii="Calibri" w:cs="Calibri" w:eastAsia="Calibri" w:hAnsi="Calibri"/>
+          <w:b/>
+          <w:bCs/>
           <w:i/>
           <w:iCs/>
-          <w:color w:val="666666"/>
+          <w:color w:val="5C381E"/>
           <w:sz w:val="20"/>
           <w:szCs w:val="20"/>
         </w:rPr>
-        <w:t xml:space="preserve">
-(Insert screenshot of /faculty page)</w:t>
+        <w:t xml:space="preserve">Figure 3.4: Lab Equipment Inventory Browsing with Availability Meters</w:t>
       </w:r>
     </w:p>
     <w:p>
@@ -4530,7 +5056,7 @@
           <w:sz w:val="26"/>
           <w:szCs w:val="26"/>
         </w:rPr>
-        <w:t xml:space="preserve">3.7 Administrator Decision Override &amp; Audit Trail</w:t>
+        <w:t xml:space="preserve">3.5 Requisition Checkout &amp; Document Upload Modal</w:t>
       </w:r>
     </w:p>
     <w:p>
@@ -4549,36 +5075,72 @@
           <w:sz w:val="24"/>
           <w:szCs w:val="24"/>
         </w:rPr>
-        <w:t xml:space="preserve">Allows administrators to supervise both labs, override faculty decisions with mandatory justifications, inspect audit trails in the override log, and provision new faculty accounts with auto-generated passwords.</w:t>
-      </w:r>
-    </w:p>
-    <w:p>
-      <w:pPr>
-        <w:spacing w:after="200" w:before="200"/>
+        <w:t xml:space="preserve">Enables students to specify required item quantities, define expected return dates, state project purpose, and upload supporting letters (PDF/PNG up to 5MB) via multipart form upload.</w:t>
+      </w:r>
+    </w:p>
+    <w:p>
+      <w:pPr>
+        <w:spacing w:after="100" w:before="180"/>
         <w:jc w:val="center"/>
       </w:pPr>
       <w:r>
-        <w:rPr>
-          <w:rFonts w:ascii="Calibri" w:cs="Calibri" w:eastAsia="Calibri" w:hAnsi="Calibri"/>
-          <w:b/>
-          <w:bCs/>
-          <w:color w:val="8D2F1E"/>
-          <w:sz w:val="24"/>
-          <w:szCs w:val="24"/>
-        </w:rPr>
-        <w:t xml:space="preserve">[INSERT IMAGE: Figure 12: Admin Dashboard &amp; Override Audit Logs]</w:t>
-      </w:r>
-      <w:r>
-        <w:rPr>
-          <w:rFonts w:ascii="Calibri" w:cs="Calibri" w:eastAsia="Calibri" w:hAnsi="Calibri"/>
+        <w:drawing>
+          <wp:inline distT="0" distB="0" distL="0" distR="0">
+            <wp:extent cx="5143500" cy="3143250"/>
+            <wp:effectExtent t="0" r="0" b="0" l="0"/>
+            <wp:docPr id="12" name=""/>
+            <wp:cNvGraphicFramePr>
+              <a:graphicFrameLocks xmlns:a="http://schemas.openxmlformats.org/drawingml/2006/main" noChangeAspect="1"/>
+            </wp:cNvGraphicFramePr>
+            <a:graphic xmlns:a="http://schemas.openxmlformats.org/drawingml/2006/main">
+              <a:graphicData uri="http://schemas.openxmlformats.org/drawingml/2006/picture">
+                <pic:pic xmlns:pic="http://schemas.openxmlformats.org/drawingml/2006/picture">
+                  <pic:nvPicPr>
+                    <pic:cNvPr id="0" name="" descr=""/>
+                    <pic:cNvPicPr>
+                      <a:picLocks noChangeAspect="1" noChangeArrowheads="1"/>
+                    </pic:cNvPicPr>
+                  </pic:nvPicPr>
+                  <pic:blipFill>
+                    <a:blip r:embed="rId18" cstate="none"/>
+                    <a:srcRect/>
+                    <a:stretch>
+                      <a:fillRect/>
+                    </a:stretch>
+                  </pic:blipFill>
+                  <pic:spPr bwMode="auto">
+                    <a:xfrm>
+                      <a:off x="0" y="0"/>
+                      <a:ext cx="5143500" cy="3143250"/>
+                    </a:xfrm>
+                    <a:prstGeom prst="rect">
+                      <a:avLst/>
+                    </a:prstGeom>
+                  </pic:spPr>
+                </pic:pic>
+              </a:graphicData>
+            </a:graphic>
+          </wp:inline>
+        </w:drawing>
+      </w:r>
+    </w:p>
+    <w:p>
+      <w:pPr>
+        <w:spacing w:after="220"/>
+        <w:jc w:val="center"/>
+      </w:pPr>
+      <w:r>
+        <w:rPr>
+          <w:rFonts w:ascii="Calibri" w:cs="Calibri" w:eastAsia="Calibri" w:hAnsi="Calibri"/>
+          <w:b/>
+          <w:bCs/>
           <w:i/>
           <w:iCs/>
-          <w:color w:val="666666"/>
+          <w:color w:val="5C381E"/>
           <w:sz w:val="20"/>
           <w:szCs w:val="20"/>
         </w:rPr>
-        <w:t xml:space="preserve">
-(Insert screenshot of /admin page)</w:t>
+        <w:t xml:space="preserve">Figure 3.5: Requisition &amp; Document Upload Checkout Modal</w:t>
       </w:r>
     </w:p>
     <w:p>
@@ -4595,7 +5157,7 @@
           <w:sz w:val="26"/>
           <w:szCs w:val="26"/>
         </w:rPr>
-        <w:t xml:space="preserve">3.8 Penalties &amp; Overdue Violation Management</w:t>
+        <w:t xml:space="preserve">3.6 Faculty Approval &amp; Handover Panel</w:t>
       </w:r>
     </w:p>
     <w:p>
@@ -4614,36 +5176,274 @@
           <w:sz w:val="24"/>
           <w:szCs w:val="24"/>
         </w:rPr>
-        <w:t xml:space="preserve">Monitors outstanding dues, calculates daily late return fines and equipment damage charges, and enables administrators to record payments or grant official waivers.</w:t>
-      </w:r>
-    </w:p>
-    <w:p>
-      <w:pPr>
-        <w:spacing w:after="200" w:before="200"/>
+        <w:t xml:space="preserve">Provides laboratory faculty with a live queue of pending requests, applicant roll numbers, purpose descriptions, and attached documents. Faculty can approve or reject with remarks, confirm physical handover (decrementing inventory), and verify returns.</w:t>
+      </w:r>
+    </w:p>
+    <w:p>
+      <w:pPr>
+        <w:spacing w:after="100" w:before="180"/>
         <w:jc w:val="center"/>
       </w:pPr>
       <w:r>
-        <w:rPr>
-          <w:rFonts w:ascii="Calibri" w:cs="Calibri" w:eastAsia="Calibri" w:hAnsi="Calibri"/>
-          <w:b/>
-          <w:bCs/>
-          <w:color w:val="8D2F1E"/>
-          <w:sz w:val="24"/>
-          <w:szCs w:val="24"/>
-        </w:rPr>
-        <w:t xml:space="preserve">[INSERT IMAGE: Figure 13: Penalties Management Interface]</w:t>
-      </w:r>
-      <w:r>
-        <w:rPr>
-          <w:rFonts w:ascii="Calibri" w:cs="Calibri" w:eastAsia="Calibri" w:hAnsi="Calibri"/>
+        <w:drawing>
+          <wp:inline distT="0" distB="0" distL="0" distR="0">
+            <wp:extent cx="5143500" cy="3143250"/>
+            <wp:effectExtent t="0" r="0" b="0" l="0"/>
+            <wp:docPr id="13" name=""/>
+            <wp:cNvGraphicFramePr>
+              <a:graphicFrameLocks xmlns:a="http://schemas.openxmlformats.org/drawingml/2006/main" noChangeAspect="1"/>
+            </wp:cNvGraphicFramePr>
+            <a:graphic xmlns:a="http://schemas.openxmlformats.org/drawingml/2006/main">
+              <a:graphicData uri="http://schemas.openxmlformats.org/drawingml/2006/picture">
+                <pic:pic xmlns:pic="http://schemas.openxmlformats.org/drawingml/2006/picture">
+                  <pic:nvPicPr>
+                    <pic:cNvPr id="0" name="" descr=""/>
+                    <pic:cNvPicPr>
+                      <a:picLocks noChangeAspect="1" noChangeArrowheads="1"/>
+                    </pic:cNvPicPr>
+                  </pic:nvPicPr>
+                  <pic:blipFill>
+                    <a:blip r:embed="rId19" cstate="none"/>
+                    <a:srcRect/>
+                    <a:stretch>
+                      <a:fillRect/>
+                    </a:stretch>
+                  </pic:blipFill>
+                  <pic:spPr bwMode="auto">
+                    <a:xfrm>
+                      <a:off x="0" y="0"/>
+                      <a:ext cx="5143500" cy="3143250"/>
+                    </a:xfrm>
+                    <a:prstGeom prst="rect">
+                      <a:avLst/>
+                    </a:prstGeom>
+                  </pic:spPr>
+                </pic:pic>
+              </a:graphicData>
+            </a:graphic>
+          </wp:inline>
+        </w:drawing>
+      </w:r>
+    </w:p>
+    <w:p>
+      <w:pPr>
+        <w:spacing w:after="220"/>
+        <w:jc w:val="center"/>
+      </w:pPr>
+      <w:r>
+        <w:rPr>
+          <w:rFonts w:ascii="Calibri" w:cs="Calibri" w:eastAsia="Calibri" w:hAnsi="Calibri"/>
+          <w:b/>
+          <w:bCs/>
           <w:i/>
           <w:iCs/>
-          <w:color w:val="666666"/>
+          <w:color w:val="5C381E"/>
           <w:sz w:val="20"/>
           <w:szCs w:val="20"/>
         </w:rPr>
-        <w:t xml:space="preserve">
-(Insert screenshot of /penalties page)</w:t>
+        <w:t xml:space="preserve">Figure 3.6: Faculty Approval Dashboard, Equipment Handover &amp; Return Verification</w:t>
+      </w:r>
+    </w:p>
+    <w:p>
+      <w:pPr>
+        <w:pStyle w:val="Heading2"/>
+        <w:spacing w:after="120" w:before="200"/>
+      </w:pPr>
+      <w:r>
+        <w:rPr>
+          <w:rFonts w:ascii="Calibri" w:cs="Calibri" w:eastAsia="Calibri" w:hAnsi="Calibri"/>
+          <w:b/>
+          <w:bCs/>
+          <w:color w:val="5C381E"/>
+          <w:sz w:val="26"/>
+          <w:szCs w:val="26"/>
+        </w:rPr>
+        <w:t xml:space="preserve">3.7 Administrator Decision Override &amp; Audit Trail</w:t>
+      </w:r>
+    </w:p>
+    <w:p>
+      <w:pPr>
+        <w:spacing w:after="140" w:line="320"/>
+        <w:jc w:val="both"/>
+      </w:pPr>
+      <w:r>
+        <w:rPr>
+          <w:rFonts w:ascii="Calibri" w:cs="Calibri" w:eastAsia="Calibri" w:hAnsi="Calibri"/>
+          <w:b w:val="false"/>
+          <w:bCs w:val="false"/>
+          <w:i w:val="false"/>
+          <w:iCs w:val="false"/>
+          <w:color w:val="222222"/>
+          <w:sz w:val="24"/>
+          <w:szCs w:val="24"/>
+        </w:rPr>
+        <w:t xml:space="preserve">Allows administrators to supervise both labs, override faculty decisions with mandatory justifications, inspect audit trails in the override log, and provision new faculty accounts with auto-generated passwords.</w:t>
+      </w:r>
+    </w:p>
+    <w:p>
+      <w:pPr>
+        <w:spacing w:after="100" w:before="180"/>
+        <w:jc w:val="center"/>
+      </w:pPr>
+      <w:r>
+        <w:drawing>
+          <wp:inline distT="0" distB="0" distL="0" distR="0">
+            <wp:extent cx="5143500" cy="3143250"/>
+            <wp:effectExtent t="0" r="0" b="0" l="0"/>
+            <wp:docPr id="14" name=""/>
+            <wp:cNvGraphicFramePr>
+              <a:graphicFrameLocks xmlns:a="http://schemas.openxmlformats.org/drawingml/2006/main" noChangeAspect="1"/>
+            </wp:cNvGraphicFramePr>
+            <a:graphic xmlns:a="http://schemas.openxmlformats.org/drawingml/2006/main">
+              <a:graphicData uri="http://schemas.openxmlformats.org/drawingml/2006/picture">
+                <pic:pic xmlns:pic="http://schemas.openxmlformats.org/drawingml/2006/picture">
+                  <pic:nvPicPr>
+                    <pic:cNvPr id="0" name="" descr=""/>
+                    <pic:cNvPicPr>
+                      <a:picLocks noChangeAspect="1" noChangeArrowheads="1"/>
+                    </pic:cNvPicPr>
+                  </pic:nvPicPr>
+                  <pic:blipFill>
+                    <a:blip r:embed="rId20" cstate="none"/>
+                    <a:srcRect/>
+                    <a:stretch>
+                      <a:fillRect/>
+                    </a:stretch>
+                  </pic:blipFill>
+                  <pic:spPr bwMode="auto">
+                    <a:xfrm>
+                      <a:off x="0" y="0"/>
+                      <a:ext cx="5143500" cy="3143250"/>
+                    </a:xfrm>
+                    <a:prstGeom prst="rect">
+                      <a:avLst/>
+                    </a:prstGeom>
+                  </pic:spPr>
+                </pic:pic>
+              </a:graphicData>
+            </a:graphic>
+          </wp:inline>
+        </w:drawing>
+      </w:r>
+    </w:p>
+    <w:p>
+      <w:pPr>
+        <w:spacing w:after="220"/>
+        <w:jc w:val="center"/>
+      </w:pPr>
+      <w:r>
+        <w:rPr>
+          <w:rFonts w:ascii="Calibri" w:cs="Calibri" w:eastAsia="Calibri" w:hAnsi="Calibri"/>
+          <w:b/>
+          <w:bCs/>
+          <w:i/>
+          <w:iCs/>
+          <w:color w:val="5C381E"/>
+          <w:sz w:val="20"/>
+          <w:szCs w:val="20"/>
+        </w:rPr>
+        <w:t xml:space="preserve">Figure 3.7: Administrator Decision Override Panel &amp; Audit Trail Log</w:t>
+      </w:r>
+    </w:p>
+    <w:p>
+      <w:pPr>
+        <w:pStyle w:val="Heading2"/>
+        <w:spacing w:after="120" w:before="200"/>
+      </w:pPr>
+      <w:r>
+        <w:rPr>
+          <w:rFonts w:ascii="Calibri" w:cs="Calibri" w:eastAsia="Calibri" w:hAnsi="Calibri"/>
+          <w:b/>
+          <w:bCs/>
+          <w:color w:val="5C381E"/>
+          <w:sz w:val="26"/>
+          <w:szCs w:val="26"/>
+        </w:rPr>
+        <w:t xml:space="preserve">3.8 Penalties &amp; Overdue Violation Management</w:t>
+      </w:r>
+    </w:p>
+    <w:p>
+      <w:pPr>
+        <w:spacing w:after="140" w:line="320"/>
+        <w:jc w:val="both"/>
+      </w:pPr>
+      <w:r>
+        <w:rPr>
+          <w:rFonts w:ascii="Calibri" w:cs="Calibri" w:eastAsia="Calibri" w:hAnsi="Calibri"/>
+          <w:b w:val="false"/>
+          <w:bCs w:val="false"/>
+          <w:i w:val="false"/>
+          <w:iCs w:val="false"/>
+          <w:color w:val="222222"/>
+          <w:sz w:val="24"/>
+          <w:szCs w:val="24"/>
+        </w:rPr>
+        <w:t xml:space="preserve">Monitors outstanding dues, calculates daily late return fines and equipment damage charges, and enables administrators to record payments or grant official waivers.</w:t>
+      </w:r>
+    </w:p>
+    <w:p>
+      <w:pPr>
+        <w:spacing w:after="100" w:before="180"/>
+        <w:jc w:val="center"/>
+      </w:pPr>
+      <w:r>
+        <w:drawing>
+          <wp:inline distT="0" distB="0" distL="0" distR="0">
+            <wp:extent cx="5143500" cy="3143250"/>
+            <wp:effectExtent t="0" r="0" b="0" l="0"/>
+            <wp:docPr id="15" name=""/>
+            <wp:cNvGraphicFramePr>
+              <a:graphicFrameLocks xmlns:a="http://schemas.openxmlformats.org/drawingml/2006/main" noChangeAspect="1"/>
+            </wp:cNvGraphicFramePr>
+            <a:graphic xmlns:a="http://schemas.openxmlformats.org/drawingml/2006/main">
+              <a:graphicData uri="http://schemas.openxmlformats.org/drawingml/2006/picture">
+                <pic:pic xmlns:pic="http://schemas.openxmlformats.org/drawingml/2006/picture">
+                  <pic:nvPicPr>
+                    <pic:cNvPr id="0" name="" descr=""/>
+                    <pic:cNvPicPr>
+                      <a:picLocks noChangeAspect="1" noChangeArrowheads="1"/>
+                    </pic:cNvPicPr>
+                  </pic:nvPicPr>
+                  <pic:blipFill>
+                    <a:blip r:embed="rId21" cstate="none"/>
+                    <a:srcRect/>
+                    <a:stretch>
+                      <a:fillRect/>
+                    </a:stretch>
+                  </pic:blipFill>
+                  <pic:spPr bwMode="auto">
+                    <a:xfrm>
+                      <a:off x="0" y="0"/>
+                      <a:ext cx="5143500" cy="3143250"/>
+                    </a:xfrm>
+                    <a:prstGeom prst="rect">
+                      <a:avLst/>
+                    </a:prstGeom>
+                  </pic:spPr>
+                </pic:pic>
+              </a:graphicData>
+            </a:graphic>
+          </wp:inline>
+        </w:drawing>
+      </w:r>
+    </w:p>
+    <w:p>
+      <w:pPr>
+        <w:spacing w:after="220"/>
+        <w:jc w:val="center"/>
+      </w:pPr>
+      <w:r>
+        <w:rPr>
+          <w:rFonts w:ascii="Calibri" w:cs="Calibri" w:eastAsia="Calibri" w:hAnsi="Calibri"/>
+          <w:b/>
+          <w:bCs/>
+          <w:i/>
+          <w:iCs/>
+          <w:color w:val="5C381E"/>
+          <w:sz w:val="20"/>
+          <w:szCs w:val="20"/>
+        </w:rPr>
+        <w:t xml:space="preserve">Figure 3.8: Penalties &amp; Overdue Violation Management Interface</w:t>
       </w:r>
     </w:p>
     <w:p>

</xml_diff>